<commit_message>
#260618 fix: fixed global settings
</commit_message>
<xml_diff>
--- a/files/komite-formu.docx
+++ b/files/komite-formu.docx
@@ -34,12 +34,80 @@
           <w:p>
             <w:pPr>
               <w:jc w:val="center"/>
-            </w:pPr>
-            <w:r>
-              <w:rPr>
-                <w:b/>
-                <w:bCs/>
-                <w:color w:val="000000"/>
+              <w:rPr>
+                <w:sz w:val="16"/>
+                <w:szCs w:val="16"/>
+              </w:rPr>
+            </w:pPr>
+            <w:r>
+              <w:rPr>
+                <w:noProof/>
+                <w:sz w:val="18"/>
+                <w:szCs w:val="18"/>
+              </w:rPr>
+              <w:drawing>
+                <wp:anchor distT="0" distB="0" distL="114300" distR="114300" simplePos="0" relativeHeight="251658240" behindDoc="0" locked="0" layoutInCell="1" allowOverlap="1" wp14:anchorId="24C24AA9" wp14:editId="1FC4C0A6">
+                  <wp:simplePos x="0" y="0"/>
+                  <wp:positionH relativeFrom="margin">
+                    <wp:posOffset>1348740</wp:posOffset>
+                  </wp:positionH>
+                  <wp:positionV relativeFrom="paragraph">
+                    <wp:posOffset>-181610</wp:posOffset>
+                  </wp:positionV>
+                  <wp:extent cx="1056640" cy="293370"/>
+                  <wp:effectExtent l="0" t="0" r="0" b="0"/>
+                  <wp:wrapNone/>
+                  <wp:docPr id="56560101" name="Resim 2"/>
+                  <wp:cNvGraphicFramePr>
+                    <a:graphicFrameLocks xmlns:a="http://schemas.openxmlformats.org/drawingml/2006/main" noChangeAspect="1"/>
+                  </wp:cNvGraphicFramePr>
+                  <a:graphic xmlns:a="http://schemas.openxmlformats.org/drawingml/2006/main">
+                    <a:graphicData uri="http://schemas.openxmlformats.org/drawingml/2006/picture">
+                      <pic:pic xmlns:pic="http://schemas.openxmlformats.org/drawingml/2006/picture">
+                        <pic:nvPicPr>
+                          <pic:cNvPr id="56560101" name="Resim 56560101"/>
+                          <pic:cNvPicPr/>
+                        </pic:nvPicPr>
+                        <pic:blipFill>
+                          <a:blip r:embed="rId8" cstate="print">
+                            <a:extLst>
+                              <a:ext uri="{28A0092B-C50C-407E-A947-70E740481C1C}">
+                                <a14:useLocalDpi xmlns:a14="http://schemas.microsoft.com/office/drawing/2010/main" val="0"/>
+                              </a:ext>
+                            </a:extLst>
+                          </a:blip>
+                          <a:stretch>
+                            <a:fillRect/>
+                          </a:stretch>
+                        </pic:blipFill>
+                        <pic:spPr>
+                          <a:xfrm>
+                            <a:off x="0" y="0"/>
+                            <a:ext cx="1056640" cy="293370"/>
+                          </a:xfrm>
+                          <a:prstGeom prst="rect">
+                            <a:avLst/>
+                          </a:prstGeom>
+                        </pic:spPr>
+                      </pic:pic>
+                    </a:graphicData>
+                  </a:graphic>
+                  <wp14:sizeRelH relativeFrom="margin">
+                    <wp14:pctWidth>0</wp14:pctWidth>
+                  </wp14:sizeRelH>
+                  <wp14:sizeRelV relativeFrom="margin">
+                    <wp14:pctHeight>0</wp14:pctHeight>
+                  </wp14:sizeRelV>
+                </wp:anchor>
+              </w:drawing>
+            </w:r>
+            <w:r>
+              <w:rPr>
+                <w:b/>
+                <w:bCs/>
+                <w:color w:val="000000"/>
+                <w:sz w:val="16"/>
+                <w:szCs w:val="16"/>
               </w:rPr>
               <w:t>TEMERRÜT VE FESİH KOMİTESİ FORMU</w:t>
             </w:r>
@@ -50,8 +118,8 @@
     <w:p/>
     <w:tbl>
       <w:tblPr>
-        <w:tblW w:w="14933" w:type="dxa"/>
-        <w:tblInd w:w="-5" w:type="dxa"/>
+        <w:tblW w:w="0" w:type="auto"/>
+        <w:jc w:val="center"/>
         <w:tblBorders>
           <w:top w:val="single" w:sz="4" w:space="0" w:color="auto"/>
           <w:left w:val="single" w:sz="4" w:space="0" w:color="auto"/>
@@ -67,12 +135,13 @@
         <w:tblLook w:val="0000" w:firstRow="0" w:lastRow="0" w:firstColumn="0" w:lastColumn="0" w:noHBand="0" w:noVBand="0"/>
       </w:tblPr>
       <w:tblGrid>
-        <w:gridCol w:w="2835"/>
-        <w:gridCol w:w="12098"/>
+        <w:gridCol w:w="2137"/>
+        <w:gridCol w:w="8319"/>
       </w:tblGrid>
       <w:tr>
         <w:trPr>
           <w:trHeight w:val="125"/>
+          <w:jc w:val="center"/>
         </w:trPr>
         <w:tc>
           <w:tcPr>
@@ -170,6 +239,7 @@
       <w:tr>
         <w:trPr>
           <w:trHeight w:val="73"/>
+          <w:jc w:val="center"/>
         </w:trPr>
         <w:tc>
           <w:tcPr>
@@ -233,13 +303,10 @@
             </w:pPr>
             <w:r>
               <w:rPr>
-                <w:b/>
-                <w:bCs/>
-                <w:color w:val="000000"/>
                 <w:sz w:val="14"/>
                 <w:szCs w:val="14"/>
               </w:rPr>
-              <w:t>10.06.2026</w:t>
+              <w:t>{{tarih}}</w:t>
             </w:r>
           </w:p>
         </w:tc>
@@ -248,7 +315,8 @@
     <w:p/>
     <w:tbl>
       <w:tblPr>
-        <w:tblW w:w="14884" w:type="dxa"/>
+        <w:tblW w:w="0" w:type="auto"/>
+        <w:jc w:val="center"/>
         <w:tblBorders>
           <w:top w:val="single" w:sz="4" w:space="0" w:color="auto"/>
           <w:left w:val="single" w:sz="4" w:space="0" w:color="auto"/>
@@ -264,26 +332,27 @@
         <w:tblLook w:val="0000" w:firstRow="0" w:lastRow="0" w:firstColumn="0" w:lastColumn="0" w:noHBand="0" w:noVBand="0"/>
       </w:tblPr>
       <w:tblGrid>
-        <w:gridCol w:w="2835"/>
         <w:gridCol w:w="2127"/>
-        <w:gridCol w:w="1134"/>
-        <w:gridCol w:w="1275"/>
-        <w:gridCol w:w="1544"/>
-        <w:gridCol w:w="1382"/>
-        <w:gridCol w:w="1689"/>
-        <w:gridCol w:w="1802"/>
-        <w:gridCol w:w="280"/>
-        <w:gridCol w:w="816"/>
+        <w:gridCol w:w="1417"/>
+        <w:gridCol w:w="851"/>
+        <w:gridCol w:w="850"/>
+        <w:gridCol w:w="1042"/>
+        <w:gridCol w:w="903"/>
+        <w:gridCol w:w="1193"/>
+        <w:gridCol w:w="1270"/>
+        <w:gridCol w:w="247"/>
+        <w:gridCol w:w="566"/>
       </w:tblGrid>
       <w:tr>
         <w:trPr>
           <w:gridAfter w:val="1"/>
-          <w:wAfter w:w="816" w:type="dxa"/>
+          <w:wAfter w:w="566" w:type="dxa"/>
           <w:trHeight w:val="115"/>
+          <w:jc w:val="center"/>
         </w:trPr>
         <w:tc>
           <w:tcPr>
-            <w:tcW w:w="14068" w:type="dxa"/>
+            <w:tcW w:w="9900" w:type="dxa"/>
             <w:gridSpan w:val="9"/>
             <w:tcBorders>
               <w:top w:val="none" w:sz="0" w:space="0" w:color="FFFFFF"/>
@@ -292,10 +361,10 @@
               <w:right w:val="none" w:sz="0" w:space="0" w:color="FFFFFF"/>
             </w:tcBorders>
             <w:tcMar>
-              <w:top w:w="80" w:type="dxa"/>
-              <w:left w:w="120" w:type="dxa"/>
-              <w:bottom w:w="80" w:type="dxa"/>
-              <w:right w:w="120" w:type="dxa"/>
+              <w:top w:w="28" w:type="dxa"/>
+              <w:left w:w="28" w:type="dxa"/>
+              <w:bottom w:w="28" w:type="dxa"/>
+              <w:right w:w="28" w:type="dxa"/>
             </w:tcMar>
             <w:vAlign w:val="center"/>
           </w:tcPr>
@@ -322,10 +391,11 @@
       <w:tr>
         <w:trPr>
           <w:trHeight w:val="272"/>
+          <w:jc w:val="center"/>
         </w:trPr>
         <w:tc>
           <w:tcPr>
-            <w:tcW w:w="2835" w:type="dxa"/>
+            <w:tcW w:w="2127" w:type="dxa"/>
             <w:tcBorders>
               <w:top w:val="single" w:sz="4" w:space="0" w:color="000000"/>
               <w:left w:val="single" w:sz="4" w:space="0" w:color="000000"/>
@@ -334,10 +404,10 @@
             </w:tcBorders>
             <w:shd w:val="clear" w:color="auto" w:fill="D9D9D9"/>
             <w:tcMar>
-              <w:top w:w="80" w:type="dxa"/>
-              <w:left w:w="120" w:type="dxa"/>
-              <w:bottom w:w="80" w:type="dxa"/>
-              <w:right w:w="120" w:type="dxa"/>
+              <w:top w:w="28" w:type="dxa"/>
+              <w:left w:w="28" w:type="dxa"/>
+              <w:bottom w:w="28" w:type="dxa"/>
+              <w:right w:w="28" w:type="dxa"/>
             </w:tcMar>
             <w:vAlign w:val="center"/>
           </w:tcPr>
@@ -345,17 +415,17 @@
             <w:pPr>
               <w:jc w:val="center"/>
               <w:rPr>
-                <w:sz w:val="14"/>
-                <w:szCs w:val="14"/>
-              </w:rPr>
-            </w:pPr>
-            <w:r>
-              <w:rPr>
-                <w:b/>
-                <w:bCs/>
-                <w:color w:val="000000"/>
-                <w:sz w:val="14"/>
-                <w:szCs w:val="14"/>
+                <w:sz w:val="12"/>
+                <w:szCs w:val="12"/>
+              </w:rPr>
+            </w:pPr>
+            <w:r>
+              <w:rPr>
+                <w:b/>
+                <w:bCs/>
+                <w:color w:val="000000"/>
+                <w:sz w:val="12"/>
+                <w:szCs w:val="12"/>
               </w:rPr>
               <w:t>Satıcı Adı</w:t>
             </w:r>
@@ -363,7 +433,7 @@
         </w:tc>
         <w:tc>
           <w:tcPr>
-            <w:tcW w:w="2127" w:type="dxa"/>
+            <w:tcW w:w="1417" w:type="dxa"/>
             <w:tcBorders>
               <w:top w:val="single" w:sz="4" w:space="0" w:color="000000"/>
               <w:left w:val="single" w:sz="4" w:space="0" w:color="000000"/>
@@ -372,10 +442,10 @@
             </w:tcBorders>
             <w:shd w:val="clear" w:color="auto" w:fill="D9D9D9"/>
             <w:tcMar>
-              <w:top w:w="80" w:type="dxa"/>
-              <w:left w:w="120" w:type="dxa"/>
-              <w:bottom w:w="80" w:type="dxa"/>
-              <w:right w:w="120" w:type="dxa"/>
+              <w:top w:w="28" w:type="dxa"/>
+              <w:left w:w="28" w:type="dxa"/>
+              <w:bottom w:w="28" w:type="dxa"/>
+              <w:right w:w="28" w:type="dxa"/>
             </w:tcMar>
             <w:vAlign w:val="center"/>
           </w:tcPr>
@@ -383,17 +453,17 @@
             <w:pPr>
               <w:jc w:val="center"/>
               <w:rPr>
-                <w:sz w:val="14"/>
-                <w:szCs w:val="14"/>
-              </w:rPr>
-            </w:pPr>
-            <w:r>
-              <w:rPr>
-                <w:b/>
-                <w:bCs/>
-                <w:color w:val="000000"/>
-                <w:sz w:val="14"/>
-                <w:szCs w:val="14"/>
+                <w:sz w:val="12"/>
+                <w:szCs w:val="12"/>
+              </w:rPr>
+            </w:pPr>
+            <w:r>
+              <w:rPr>
+                <w:b/>
+                <w:bCs/>
+                <w:color w:val="000000"/>
+                <w:sz w:val="12"/>
+                <w:szCs w:val="12"/>
               </w:rPr>
               <w:t>Proje Adı</w:t>
             </w:r>
@@ -401,7 +471,7 @@
         </w:tc>
         <w:tc>
           <w:tcPr>
-            <w:tcW w:w="1134" w:type="dxa"/>
+            <w:tcW w:w="851" w:type="dxa"/>
             <w:tcBorders>
               <w:top w:val="single" w:sz="4" w:space="0" w:color="000000"/>
               <w:left w:val="single" w:sz="4" w:space="0" w:color="000000"/>
@@ -410,10 +480,10 @@
             </w:tcBorders>
             <w:shd w:val="clear" w:color="auto" w:fill="D9D9D9"/>
             <w:tcMar>
-              <w:top w:w="80" w:type="dxa"/>
-              <w:left w:w="120" w:type="dxa"/>
-              <w:bottom w:w="80" w:type="dxa"/>
-              <w:right w:w="120" w:type="dxa"/>
+              <w:top w:w="28" w:type="dxa"/>
+              <w:left w:w="28" w:type="dxa"/>
+              <w:bottom w:w="28" w:type="dxa"/>
+              <w:right w:w="28" w:type="dxa"/>
             </w:tcMar>
             <w:vAlign w:val="center"/>
           </w:tcPr>
@@ -421,17 +491,17 @@
             <w:pPr>
               <w:jc w:val="center"/>
               <w:rPr>
-                <w:sz w:val="14"/>
-                <w:szCs w:val="14"/>
-              </w:rPr>
-            </w:pPr>
-            <w:r>
-              <w:rPr>
-                <w:b/>
-                <w:bCs/>
-                <w:color w:val="000000"/>
-                <w:sz w:val="14"/>
-                <w:szCs w:val="14"/>
+                <w:sz w:val="12"/>
+                <w:szCs w:val="12"/>
+              </w:rPr>
+            </w:pPr>
+            <w:r>
+              <w:rPr>
+                <w:b/>
+                <w:bCs/>
+                <w:color w:val="000000"/>
+                <w:sz w:val="12"/>
+                <w:szCs w:val="12"/>
               </w:rPr>
               <w:t>Kira Planı No</w:t>
             </w:r>
@@ -439,7 +509,7 @@
         </w:tc>
         <w:tc>
           <w:tcPr>
-            <w:tcW w:w="1275" w:type="dxa"/>
+            <w:tcW w:w="850" w:type="dxa"/>
             <w:tcBorders>
               <w:top w:val="single" w:sz="4" w:space="0" w:color="000000"/>
               <w:left w:val="single" w:sz="4" w:space="0" w:color="000000"/>
@@ -448,10 +518,10 @@
             </w:tcBorders>
             <w:shd w:val="clear" w:color="auto" w:fill="D9D9D9"/>
             <w:tcMar>
-              <w:top w:w="80" w:type="dxa"/>
-              <w:left w:w="120" w:type="dxa"/>
-              <w:bottom w:w="80" w:type="dxa"/>
-              <w:right w:w="120" w:type="dxa"/>
+              <w:top w:w="28" w:type="dxa"/>
+              <w:left w:w="28" w:type="dxa"/>
+              <w:bottom w:w="28" w:type="dxa"/>
+              <w:right w:w="28" w:type="dxa"/>
             </w:tcMar>
             <w:vAlign w:val="center"/>
           </w:tcPr>
@@ -459,17 +529,17 @@
             <w:pPr>
               <w:jc w:val="center"/>
               <w:rPr>
-                <w:sz w:val="14"/>
-                <w:szCs w:val="14"/>
-              </w:rPr>
-            </w:pPr>
-            <w:r>
-              <w:rPr>
-                <w:b/>
-                <w:bCs/>
-                <w:color w:val="000000"/>
-                <w:sz w:val="14"/>
-                <w:szCs w:val="14"/>
+                <w:sz w:val="12"/>
+                <w:szCs w:val="12"/>
+              </w:rPr>
+            </w:pPr>
+            <w:r>
+              <w:rPr>
+                <w:b/>
+                <w:bCs/>
+                <w:color w:val="000000"/>
+                <w:sz w:val="12"/>
+                <w:szCs w:val="12"/>
               </w:rPr>
               <w:t>Proje Statüsü</w:t>
             </w:r>
@@ -477,7 +547,7 @@
         </w:tc>
         <w:tc>
           <w:tcPr>
-            <w:tcW w:w="1544" w:type="dxa"/>
+            <w:tcW w:w="1042" w:type="dxa"/>
             <w:tcBorders>
               <w:top w:val="single" w:sz="4" w:space="0" w:color="000000"/>
               <w:left w:val="single" w:sz="4" w:space="0" w:color="000000"/>
@@ -486,10 +556,10 @@
             </w:tcBorders>
             <w:shd w:val="clear" w:color="auto" w:fill="D9D9D9"/>
             <w:tcMar>
-              <w:top w:w="80" w:type="dxa"/>
-              <w:left w:w="120" w:type="dxa"/>
-              <w:bottom w:w="80" w:type="dxa"/>
-              <w:right w:w="120" w:type="dxa"/>
+              <w:top w:w="28" w:type="dxa"/>
+              <w:left w:w="28" w:type="dxa"/>
+              <w:bottom w:w="28" w:type="dxa"/>
+              <w:right w:w="28" w:type="dxa"/>
             </w:tcMar>
             <w:vAlign w:val="center"/>
           </w:tcPr>
@@ -497,17 +567,17 @@
             <w:pPr>
               <w:jc w:val="center"/>
               <w:rPr>
-                <w:sz w:val="14"/>
-                <w:szCs w:val="14"/>
-              </w:rPr>
-            </w:pPr>
-            <w:r>
-              <w:rPr>
-                <w:b/>
-                <w:bCs/>
-                <w:color w:val="000000"/>
-                <w:sz w:val="14"/>
-                <w:szCs w:val="14"/>
+                <w:sz w:val="12"/>
+                <w:szCs w:val="12"/>
+              </w:rPr>
+            </w:pPr>
+            <w:r>
+              <w:rPr>
+                <w:b/>
+                <w:bCs/>
+                <w:color w:val="000000"/>
+                <w:sz w:val="12"/>
+                <w:szCs w:val="12"/>
               </w:rPr>
               <w:t>Sözleşme Tarihi</w:t>
             </w:r>
@@ -515,7 +585,7 @@
         </w:tc>
         <w:tc>
           <w:tcPr>
-            <w:tcW w:w="1382" w:type="dxa"/>
+            <w:tcW w:w="903" w:type="dxa"/>
             <w:tcBorders>
               <w:top w:val="single" w:sz="4" w:space="0" w:color="000000"/>
               <w:left w:val="single" w:sz="4" w:space="0" w:color="000000"/>
@@ -524,10 +594,10 @@
             </w:tcBorders>
             <w:shd w:val="clear" w:color="auto" w:fill="D9D9D9"/>
             <w:tcMar>
-              <w:top w:w="80" w:type="dxa"/>
-              <w:left w:w="120" w:type="dxa"/>
-              <w:bottom w:w="80" w:type="dxa"/>
-              <w:right w:w="120" w:type="dxa"/>
+              <w:top w:w="28" w:type="dxa"/>
+              <w:left w:w="28" w:type="dxa"/>
+              <w:bottom w:w="28" w:type="dxa"/>
+              <w:right w:w="28" w:type="dxa"/>
             </w:tcMar>
             <w:vAlign w:val="center"/>
           </w:tcPr>
@@ -535,17 +605,17 @@
             <w:pPr>
               <w:jc w:val="center"/>
               <w:rPr>
-                <w:sz w:val="14"/>
-                <w:szCs w:val="14"/>
-              </w:rPr>
-            </w:pPr>
-            <w:r>
-              <w:rPr>
-                <w:b/>
-                <w:bCs/>
-                <w:color w:val="000000"/>
-                <w:sz w:val="14"/>
-                <w:szCs w:val="14"/>
+                <w:sz w:val="12"/>
+                <w:szCs w:val="12"/>
+              </w:rPr>
+            </w:pPr>
+            <w:r>
+              <w:rPr>
+                <w:b/>
+                <w:bCs/>
+                <w:color w:val="000000"/>
+                <w:sz w:val="12"/>
+                <w:szCs w:val="12"/>
               </w:rPr>
               <w:t>KDV Oranı %</w:t>
             </w:r>
@@ -553,7 +623,7 @@
         </w:tc>
         <w:tc>
           <w:tcPr>
-            <w:tcW w:w="1689" w:type="dxa"/>
+            <w:tcW w:w="1193" w:type="dxa"/>
             <w:tcBorders>
               <w:top w:val="single" w:sz="4" w:space="0" w:color="000000"/>
               <w:left w:val="single" w:sz="4" w:space="0" w:color="000000"/>
@@ -562,10 +632,10 @@
             </w:tcBorders>
             <w:shd w:val="clear" w:color="auto" w:fill="D9D9D9"/>
             <w:tcMar>
-              <w:top w:w="80" w:type="dxa"/>
-              <w:left w:w="120" w:type="dxa"/>
-              <w:bottom w:w="80" w:type="dxa"/>
-              <w:right w:w="120" w:type="dxa"/>
+              <w:top w:w="28" w:type="dxa"/>
+              <w:left w:w="28" w:type="dxa"/>
+              <w:bottom w:w="28" w:type="dxa"/>
+              <w:right w:w="28" w:type="dxa"/>
             </w:tcMar>
             <w:vAlign w:val="center"/>
           </w:tcPr>
@@ -573,17 +643,17 @@
             <w:pPr>
               <w:jc w:val="center"/>
               <w:rPr>
-                <w:sz w:val="14"/>
-                <w:szCs w:val="14"/>
-              </w:rPr>
-            </w:pPr>
-            <w:r>
-              <w:rPr>
-                <w:b/>
-                <w:bCs/>
-                <w:color w:val="000000"/>
-                <w:sz w:val="14"/>
-                <w:szCs w:val="14"/>
+                <w:sz w:val="12"/>
+                <w:szCs w:val="12"/>
+              </w:rPr>
+            </w:pPr>
+            <w:r>
+              <w:rPr>
+                <w:b/>
+                <w:bCs/>
+                <w:color w:val="000000"/>
+                <w:sz w:val="12"/>
+                <w:szCs w:val="12"/>
               </w:rPr>
               <w:t>Sözleşme vadesi (Peşinat hariç)</w:t>
             </w:r>
@@ -591,7 +661,7 @@
         </w:tc>
         <w:tc>
           <w:tcPr>
-            <w:tcW w:w="1802" w:type="dxa"/>
+            <w:tcW w:w="1270" w:type="dxa"/>
             <w:tcBorders>
               <w:top w:val="single" w:sz="4" w:space="0" w:color="000000"/>
               <w:left w:val="single" w:sz="4" w:space="0" w:color="000000"/>
@@ -600,10 +670,10 @@
             </w:tcBorders>
             <w:shd w:val="clear" w:color="auto" w:fill="D9D9D9"/>
             <w:tcMar>
-              <w:top w:w="80" w:type="dxa"/>
-              <w:left w:w="120" w:type="dxa"/>
-              <w:bottom w:w="80" w:type="dxa"/>
-              <w:right w:w="120" w:type="dxa"/>
+              <w:top w:w="28" w:type="dxa"/>
+              <w:left w:w="28" w:type="dxa"/>
+              <w:bottom w:w="28" w:type="dxa"/>
+              <w:right w:w="28" w:type="dxa"/>
             </w:tcMar>
             <w:vAlign w:val="center"/>
           </w:tcPr>
@@ -611,17 +681,17 @@
             <w:pPr>
               <w:jc w:val="center"/>
               <w:rPr>
-                <w:sz w:val="14"/>
-                <w:szCs w:val="14"/>
-              </w:rPr>
-            </w:pPr>
-            <w:r>
-              <w:rPr>
-                <w:b/>
-                <w:bCs/>
-                <w:color w:val="000000"/>
-                <w:sz w:val="14"/>
-                <w:szCs w:val="14"/>
+                <w:sz w:val="12"/>
+                <w:szCs w:val="12"/>
+              </w:rPr>
+            </w:pPr>
+            <w:r>
+              <w:rPr>
+                <w:b/>
+                <w:bCs/>
+                <w:color w:val="000000"/>
+                <w:sz w:val="12"/>
+                <w:szCs w:val="12"/>
               </w:rPr>
               <w:t>Satış Bedeli (KDV dahil)</w:t>
             </w:r>
@@ -629,7 +699,7 @@
         </w:tc>
         <w:tc>
           <w:tcPr>
-            <w:tcW w:w="1096" w:type="dxa"/>
+            <w:tcW w:w="813" w:type="dxa"/>
             <w:gridSpan w:val="2"/>
             <w:tcBorders>
               <w:top w:val="single" w:sz="4" w:space="0" w:color="000000"/>
@@ -639,10 +709,10 @@
             </w:tcBorders>
             <w:shd w:val="clear" w:color="auto" w:fill="D9D9D9"/>
             <w:tcMar>
-              <w:top w:w="80" w:type="dxa"/>
-              <w:left w:w="120" w:type="dxa"/>
-              <w:bottom w:w="80" w:type="dxa"/>
-              <w:right w:w="120" w:type="dxa"/>
+              <w:top w:w="28" w:type="dxa"/>
+              <w:left w:w="28" w:type="dxa"/>
+              <w:bottom w:w="28" w:type="dxa"/>
+              <w:right w:w="28" w:type="dxa"/>
             </w:tcMar>
             <w:vAlign w:val="center"/>
           </w:tcPr>
@@ -650,17 +720,17 @@
             <w:pPr>
               <w:jc w:val="center"/>
               <w:rPr>
-                <w:sz w:val="14"/>
-                <w:szCs w:val="14"/>
-              </w:rPr>
-            </w:pPr>
-            <w:r>
-              <w:rPr>
-                <w:b/>
-                <w:bCs/>
-                <w:color w:val="000000"/>
-                <w:sz w:val="14"/>
-                <w:szCs w:val="14"/>
+                <w:sz w:val="12"/>
+                <w:szCs w:val="12"/>
+              </w:rPr>
+            </w:pPr>
+            <w:r>
+              <w:rPr>
+                <w:b/>
+                <w:bCs/>
+                <w:color w:val="000000"/>
+                <w:sz w:val="12"/>
+                <w:szCs w:val="12"/>
               </w:rPr>
               <w:t>Para Birimi</w:t>
             </w:r>
@@ -670,36 +740,37 @@
       <w:tr>
         <w:trPr>
           <w:trHeight w:val="522"/>
+          <w:jc w:val="center"/>
         </w:trPr>
         <w:tc>
           <w:tcPr>
-            <w:tcW w:w="2835" w:type="dxa"/>
-            <w:tcBorders>
-              <w:top w:val="single" w:sz="4" w:space="0" w:color="000000"/>
-              <w:left w:val="single" w:sz="4" w:space="0" w:color="000000"/>
-              <w:bottom w:val="single" w:sz="4" w:space="0" w:color="000000"/>
-              <w:right w:val="single" w:sz="4" w:space="0" w:color="000000"/>
-            </w:tcBorders>
-            <w:tcMar>
-              <w:top w:w="80" w:type="dxa"/>
-              <w:left w:w="120" w:type="dxa"/>
-              <w:bottom w:w="80" w:type="dxa"/>
-              <w:right w:w="120" w:type="dxa"/>
-            </w:tcMar>
-            <w:vAlign w:val="center"/>
-          </w:tcPr>
-          <w:p>
-            <w:pPr>
-              <w:rPr>
-                <w:sz w:val="14"/>
-                <w:szCs w:val="14"/>
-              </w:rPr>
-            </w:pPr>
-            <w:r>
-              <w:rPr>
-                <w:color w:val="000000"/>
-                <w:sz w:val="14"/>
-                <w:szCs w:val="14"/>
+            <w:tcW w:w="2127" w:type="dxa"/>
+            <w:tcBorders>
+              <w:top w:val="single" w:sz="4" w:space="0" w:color="000000"/>
+              <w:left w:val="single" w:sz="4" w:space="0" w:color="000000"/>
+              <w:bottom w:val="single" w:sz="4" w:space="0" w:color="000000"/>
+              <w:right w:val="single" w:sz="4" w:space="0" w:color="000000"/>
+            </w:tcBorders>
+            <w:tcMar>
+              <w:top w:w="28" w:type="dxa"/>
+              <w:left w:w="28" w:type="dxa"/>
+              <w:bottom w:w="28" w:type="dxa"/>
+              <w:right w:w="28" w:type="dxa"/>
+            </w:tcMar>
+            <w:vAlign w:val="center"/>
+          </w:tcPr>
+          <w:p>
+            <w:pPr>
+              <w:rPr>
+                <w:sz w:val="12"/>
+                <w:szCs w:val="12"/>
+              </w:rPr>
+            </w:pPr>
+            <w:r>
+              <w:rPr>
+                <w:color w:val="000000"/>
+                <w:sz w:val="12"/>
+                <w:szCs w:val="12"/>
               </w:rPr>
               <w:t>BALIKESİR KASABA GAYRİMENKUL SATIŞ PAZARLAMA İŞLETME HİZMETLERİ ANONİM ŞİRKETİ</w:t>
             </w:r>
@@ -707,33 +778,33 @@
         </w:tc>
         <w:tc>
           <w:tcPr>
-            <w:tcW w:w="2127" w:type="dxa"/>
-            <w:tcBorders>
-              <w:top w:val="single" w:sz="4" w:space="0" w:color="000000"/>
-              <w:left w:val="single" w:sz="4" w:space="0" w:color="000000"/>
-              <w:bottom w:val="single" w:sz="4" w:space="0" w:color="000000"/>
-              <w:right w:val="single" w:sz="4" w:space="0" w:color="000000"/>
-            </w:tcBorders>
-            <w:tcMar>
-              <w:top w:w="80" w:type="dxa"/>
-              <w:left w:w="120" w:type="dxa"/>
-              <w:bottom w:w="80" w:type="dxa"/>
-              <w:right w:w="120" w:type="dxa"/>
-            </w:tcMar>
-            <w:vAlign w:val="center"/>
-          </w:tcPr>
-          <w:p>
-            <w:pPr>
-              <w:rPr>
-                <w:sz w:val="14"/>
-                <w:szCs w:val="14"/>
-              </w:rPr>
-            </w:pPr>
-            <w:r>
-              <w:rPr>
-                <w:color w:val="000000"/>
-                <w:sz w:val="14"/>
-                <w:szCs w:val="14"/>
+            <w:tcW w:w="1417" w:type="dxa"/>
+            <w:tcBorders>
+              <w:top w:val="single" w:sz="4" w:space="0" w:color="000000"/>
+              <w:left w:val="single" w:sz="4" w:space="0" w:color="000000"/>
+              <w:bottom w:val="single" w:sz="4" w:space="0" w:color="000000"/>
+              <w:right w:val="single" w:sz="4" w:space="0" w:color="000000"/>
+            </w:tcBorders>
+            <w:tcMar>
+              <w:top w:w="28" w:type="dxa"/>
+              <w:left w:w="28" w:type="dxa"/>
+              <w:bottom w:w="28" w:type="dxa"/>
+              <w:right w:w="28" w:type="dxa"/>
+            </w:tcMar>
+            <w:vAlign w:val="center"/>
+          </w:tcPr>
+          <w:p>
+            <w:pPr>
+              <w:rPr>
+                <w:sz w:val="12"/>
+                <w:szCs w:val="12"/>
+              </w:rPr>
+            </w:pPr>
+            <w:r>
+              <w:rPr>
+                <w:color w:val="000000"/>
+                <w:sz w:val="12"/>
+                <w:szCs w:val="12"/>
               </w:rPr>
               <w:t>SİNPAŞ KASABA THERMAL WELLNESS RESORT</w:t>
             </w:r>
@@ -741,33 +812,34 @@
         </w:tc>
         <w:tc>
           <w:tcPr>
-            <w:tcW w:w="1134" w:type="dxa"/>
-            <w:tcBorders>
-              <w:top w:val="single" w:sz="4" w:space="0" w:color="000000"/>
-              <w:left w:val="single" w:sz="4" w:space="0" w:color="000000"/>
-              <w:bottom w:val="single" w:sz="4" w:space="0" w:color="000000"/>
-              <w:right w:val="single" w:sz="4" w:space="0" w:color="000000"/>
-            </w:tcBorders>
-            <w:tcMar>
-              <w:top w:w="80" w:type="dxa"/>
-              <w:left w:w="120" w:type="dxa"/>
-              <w:bottom w:w="80" w:type="dxa"/>
-              <w:right w:w="120" w:type="dxa"/>
-            </w:tcMar>
-            <w:vAlign w:val="center"/>
-          </w:tcPr>
-          <w:p>
-            <w:pPr>
-              <w:rPr>
-                <w:sz w:val="14"/>
-                <w:szCs w:val="14"/>
-              </w:rPr>
-            </w:pPr>
-            <w:r>
-              <w:rPr>
-                <w:color w:val="000000"/>
-                <w:sz w:val="14"/>
-                <w:szCs w:val="14"/>
+            <w:tcW w:w="851" w:type="dxa"/>
+            <w:tcBorders>
+              <w:top w:val="single" w:sz="4" w:space="0" w:color="000000"/>
+              <w:left w:val="single" w:sz="4" w:space="0" w:color="000000"/>
+              <w:bottom w:val="single" w:sz="4" w:space="0" w:color="000000"/>
+              <w:right w:val="single" w:sz="4" w:space="0" w:color="000000"/>
+            </w:tcBorders>
+            <w:tcMar>
+              <w:top w:w="28" w:type="dxa"/>
+              <w:left w:w="28" w:type="dxa"/>
+              <w:bottom w:w="28" w:type="dxa"/>
+              <w:right w:w="28" w:type="dxa"/>
+            </w:tcMar>
+            <w:vAlign w:val="center"/>
+          </w:tcPr>
+          <w:p>
+            <w:pPr>
+              <w:jc w:val="center"/>
+              <w:rPr>
+                <w:sz w:val="12"/>
+                <w:szCs w:val="12"/>
+              </w:rPr>
+            </w:pPr>
+            <w:r>
+              <w:rPr>
+                <w:color w:val="000000"/>
+                <w:sz w:val="12"/>
+                <w:szCs w:val="12"/>
               </w:rPr>
               <w:t>67480</w:t>
             </w:r>
@@ -775,33 +847,34 @@
         </w:tc>
         <w:tc>
           <w:tcPr>
-            <w:tcW w:w="1275" w:type="dxa"/>
-            <w:tcBorders>
-              <w:top w:val="single" w:sz="4" w:space="0" w:color="000000"/>
-              <w:left w:val="single" w:sz="4" w:space="0" w:color="000000"/>
-              <w:bottom w:val="single" w:sz="4" w:space="0" w:color="000000"/>
-              <w:right w:val="single" w:sz="4" w:space="0" w:color="000000"/>
-            </w:tcBorders>
-            <w:tcMar>
-              <w:top w:w="80" w:type="dxa"/>
-              <w:left w:w="120" w:type="dxa"/>
-              <w:bottom w:w="80" w:type="dxa"/>
-              <w:right w:w="120" w:type="dxa"/>
-            </w:tcMar>
-            <w:vAlign w:val="center"/>
-          </w:tcPr>
-          <w:p>
-            <w:pPr>
-              <w:rPr>
-                <w:sz w:val="14"/>
-                <w:szCs w:val="14"/>
+            <w:tcW w:w="850" w:type="dxa"/>
+            <w:tcBorders>
+              <w:top w:val="single" w:sz="4" w:space="0" w:color="000000"/>
+              <w:left w:val="single" w:sz="4" w:space="0" w:color="000000"/>
+              <w:bottom w:val="single" w:sz="4" w:space="0" w:color="000000"/>
+              <w:right w:val="single" w:sz="4" w:space="0" w:color="000000"/>
+            </w:tcBorders>
+            <w:tcMar>
+              <w:top w:w="28" w:type="dxa"/>
+              <w:left w:w="28" w:type="dxa"/>
+              <w:bottom w:w="28" w:type="dxa"/>
+              <w:right w:w="28" w:type="dxa"/>
+            </w:tcMar>
+            <w:vAlign w:val="center"/>
+          </w:tcPr>
+          <w:p>
+            <w:pPr>
+              <w:jc w:val="center"/>
+              <w:rPr>
+                <w:sz w:val="12"/>
+                <w:szCs w:val="12"/>
               </w:rPr>
             </w:pPr>
             <w:r>
               <w:rPr>
                 <w:color w:val="FF0000"/>
-                <w:sz w:val="14"/>
-                <w:szCs w:val="14"/>
+                <w:sz w:val="12"/>
+                <w:szCs w:val="12"/>
               </w:rPr>
               <w:t>Planlandı</w:t>
             </w:r>
@@ -809,33 +882,34 @@
         </w:tc>
         <w:tc>
           <w:tcPr>
-            <w:tcW w:w="1544" w:type="dxa"/>
-            <w:tcBorders>
-              <w:top w:val="single" w:sz="4" w:space="0" w:color="000000"/>
-              <w:left w:val="single" w:sz="4" w:space="0" w:color="000000"/>
-              <w:bottom w:val="single" w:sz="4" w:space="0" w:color="000000"/>
-              <w:right w:val="single" w:sz="4" w:space="0" w:color="000000"/>
-            </w:tcBorders>
-            <w:tcMar>
-              <w:top w:w="80" w:type="dxa"/>
-              <w:left w:w="120" w:type="dxa"/>
-              <w:bottom w:w="80" w:type="dxa"/>
-              <w:right w:w="120" w:type="dxa"/>
-            </w:tcMar>
-            <w:vAlign w:val="center"/>
-          </w:tcPr>
-          <w:p>
-            <w:pPr>
-              <w:rPr>
-                <w:sz w:val="14"/>
-                <w:szCs w:val="14"/>
-              </w:rPr>
-            </w:pPr>
-            <w:r>
-              <w:rPr>
-                <w:color w:val="000000"/>
-                <w:sz w:val="14"/>
-                <w:szCs w:val="14"/>
+            <w:tcW w:w="1042" w:type="dxa"/>
+            <w:tcBorders>
+              <w:top w:val="single" w:sz="4" w:space="0" w:color="000000"/>
+              <w:left w:val="single" w:sz="4" w:space="0" w:color="000000"/>
+              <w:bottom w:val="single" w:sz="4" w:space="0" w:color="000000"/>
+              <w:right w:val="single" w:sz="4" w:space="0" w:color="000000"/>
+            </w:tcBorders>
+            <w:tcMar>
+              <w:top w:w="28" w:type="dxa"/>
+              <w:left w:w="28" w:type="dxa"/>
+              <w:bottom w:w="28" w:type="dxa"/>
+              <w:right w:w="28" w:type="dxa"/>
+            </w:tcMar>
+            <w:vAlign w:val="center"/>
+          </w:tcPr>
+          <w:p>
+            <w:pPr>
+              <w:jc w:val="center"/>
+              <w:rPr>
+                <w:sz w:val="12"/>
+                <w:szCs w:val="12"/>
+              </w:rPr>
+            </w:pPr>
+            <w:r>
+              <w:rPr>
+                <w:color w:val="000000"/>
+                <w:sz w:val="12"/>
+                <w:szCs w:val="12"/>
               </w:rPr>
               <w:t>18.12.2025</w:t>
             </w:r>
@@ -843,18 +917,18 @@
         </w:tc>
         <w:tc>
           <w:tcPr>
-            <w:tcW w:w="1382" w:type="dxa"/>
-            <w:tcBorders>
-              <w:top w:val="single" w:sz="4" w:space="0" w:color="000000"/>
-              <w:left w:val="single" w:sz="4" w:space="0" w:color="000000"/>
-              <w:bottom w:val="single" w:sz="4" w:space="0" w:color="000000"/>
-              <w:right w:val="single" w:sz="4" w:space="0" w:color="000000"/>
-            </w:tcBorders>
-            <w:tcMar>
-              <w:top w:w="80" w:type="dxa"/>
-              <w:left w:w="120" w:type="dxa"/>
-              <w:bottom w:w="80" w:type="dxa"/>
-              <w:right w:w="120" w:type="dxa"/>
+            <w:tcW w:w="903" w:type="dxa"/>
+            <w:tcBorders>
+              <w:top w:val="single" w:sz="4" w:space="0" w:color="000000"/>
+              <w:left w:val="single" w:sz="4" w:space="0" w:color="000000"/>
+              <w:bottom w:val="single" w:sz="4" w:space="0" w:color="000000"/>
+              <w:right w:val="single" w:sz="4" w:space="0" w:color="000000"/>
+            </w:tcBorders>
+            <w:tcMar>
+              <w:top w:w="28" w:type="dxa"/>
+              <w:left w:w="28" w:type="dxa"/>
+              <w:bottom w:w="28" w:type="dxa"/>
+              <w:right w:w="28" w:type="dxa"/>
             </w:tcMar>
             <w:vAlign w:val="center"/>
           </w:tcPr>
@@ -862,15 +936,15 @@
             <w:pPr>
               <w:jc w:val="center"/>
               <w:rPr>
-                <w:sz w:val="14"/>
-                <w:szCs w:val="14"/>
-              </w:rPr>
-            </w:pPr>
-            <w:r>
-              <w:rPr>
-                <w:color w:val="000000"/>
-                <w:sz w:val="14"/>
-                <w:szCs w:val="14"/>
+                <w:sz w:val="12"/>
+                <w:szCs w:val="12"/>
+              </w:rPr>
+            </w:pPr>
+            <w:r>
+              <w:rPr>
+                <w:color w:val="000000"/>
+                <w:sz w:val="12"/>
+                <w:szCs w:val="12"/>
               </w:rPr>
               <w:t>20</w:t>
             </w:r>
@@ -878,18 +952,18 @@
         </w:tc>
         <w:tc>
           <w:tcPr>
-            <w:tcW w:w="1689" w:type="dxa"/>
-            <w:tcBorders>
-              <w:top w:val="single" w:sz="4" w:space="0" w:color="000000"/>
-              <w:left w:val="single" w:sz="4" w:space="0" w:color="000000"/>
-              <w:bottom w:val="single" w:sz="4" w:space="0" w:color="000000"/>
-              <w:right w:val="single" w:sz="4" w:space="0" w:color="000000"/>
-            </w:tcBorders>
-            <w:tcMar>
-              <w:top w:w="80" w:type="dxa"/>
-              <w:left w:w="120" w:type="dxa"/>
-              <w:bottom w:w="80" w:type="dxa"/>
-              <w:right w:w="120" w:type="dxa"/>
+            <w:tcW w:w="1193" w:type="dxa"/>
+            <w:tcBorders>
+              <w:top w:val="single" w:sz="4" w:space="0" w:color="000000"/>
+              <w:left w:val="single" w:sz="4" w:space="0" w:color="000000"/>
+              <w:bottom w:val="single" w:sz="4" w:space="0" w:color="000000"/>
+              <w:right w:val="single" w:sz="4" w:space="0" w:color="000000"/>
+            </w:tcBorders>
+            <w:tcMar>
+              <w:top w:w="28" w:type="dxa"/>
+              <w:left w:w="28" w:type="dxa"/>
+              <w:bottom w:w="28" w:type="dxa"/>
+              <w:right w:w="28" w:type="dxa"/>
             </w:tcMar>
             <w:vAlign w:val="center"/>
           </w:tcPr>
@@ -897,15 +971,15 @@
             <w:pPr>
               <w:jc w:val="center"/>
               <w:rPr>
-                <w:sz w:val="14"/>
-                <w:szCs w:val="14"/>
-              </w:rPr>
-            </w:pPr>
-            <w:r>
-              <w:rPr>
-                <w:color w:val="000000"/>
-                <w:sz w:val="14"/>
-                <w:szCs w:val="14"/>
+                <w:sz w:val="12"/>
+                <w:szCs w:val="12"/>
+              </w:rPr>
+            </w:pPr>
+            <w:r>
+              <w:rPr>
+                <w:color w:val="000000"/>
+                <w:sz w:val="12"/>
+                <w:szCs w:val="12"/>
               </w:rPr>
               <w:t>31</w:t>
             </w:r>
@@ -913,18 +987,18 @@
         </w:tc>
         <w:tc>
           <w:tcPr>
-            <w:tcW w:w="1802" w:type="dxa"/>
-            <w:tcBorders>
-              <w:top w:val="single" w:sz="4" w:space="0" w:color="000000"/>
-              <w:left w:val="single" w:sz="4" w:space="0" w:color="000000"/>
-              <w:bottom w:val="single" w:sz="4" w:space="0" w:color="000000"/>
-              <w:right w:val="single" w:sz="4" w:space="0" w:color="000000"/>
-            </w:tcBorders>
-            <w:tcMar>
-              <w:top w:w="80" w:type="dxa"/>
-              <w:left w:w="120" w:type="dxa"/>
-              <w:bottom w:w="80" w:type="dxa"/>
-              <w:right w:w="120" w:type="dxa"/>
+            <w:tcW w:w="1270" w:type="dxa"/>
+            <w:tcBorders>
+              <w:top w:val="single" w:sz="4" w:space="0" w:color="000000"/>
+              <w:left w:val="single" w:sz="4" w:space="0" w:color="000000"/>
+              <w:bottom w:val="single" w:sz="4" w:space="0" w:color="000000"/>
+              <w:right w:val="single" w:sz="4" w:space="0" w:color="000000"/>
+            </w:tcBorders>
+            <w:tcMar>
+              <w:top w:w="28" w:type="dxa"/>
+              <w:left w:w="28" w:type="dxa"/>
+              <w:bottom w:w="28" w:type="dxa"/>
+              <w:right w:w="28" w:type="dxa"/>
             </w:tcMar>
             <w:vAlign w:val="center"/>
           </w:tcPr>
@@ -932,15 +1006,15 @@
             <w:pPr>
               <w:jc w:val="right"/>
               <w:rPr>
-                <w:sz w:val="14"/>
-                <w:szCs w:val="14"/>
-              </w:rPr>
-            </w:pPr>
-            <w:r>
-              <w:rPr>
-                <w:color w:val="000000"/>
-                <w:sz w:val="14"/>
-                <w:szCs w:val="14"/>
+                <w:sz w:val="12"/>
+                <w:szCs w:val="12"/>
+              </w:rPr>
+            </w:pPr>
+            <w:r>
+              <w:rPr>
+                <w:color w:val="000000"/>
+                <w:sz w:val="12"/>
+                <w:szCs w:val="12"/>
               </w:rPr>
               <w:t>617.526,00</w:t>
             </w:r>
@@ -948,7 +1022,7 @@
         </w:tc>
         <w:tc>
           <w:tcPr>
-            <w:tcW w:w="1096" w:type="dxa"/>
+            <w:tcW w:w="813" w:type="dxa"/>
             <w:gridSpan w:val="2"/>
             <w:tcBorders>
               <w:top w:val="single" w:sz="4" w:space="0" w:color="000000"/>
@@ -957,25 +1031,25 @@
               <w:right w:val="single" w:sz="4" w:space="0" w:color="000000"/>
             </w:tcBorders>
             <w:tcMar>
-              <w:top w:w="80" w:type="dxa"/>
-              <w:left w:w="120" w:type="dxa"/>
-              <w:bottom w:w="80" w:type="dxa"/>
-              <w:right w:w="120" w:type="dxa"/>
-            </w:tcMar>
-            <w:vAlign w:val="center"/>
-          </w:tcPr>
-          <w:p>
-            <w:pPr>
-              <w:rPr>
-                <w:sz w:val="14"/>
-                <w:szCs w:val="14"/>
-              </w:rPr>
-            </w:pPr>
-            <w:r>
-              <w:rPr>
-                <w:color w:val="000000"/>
-                <w:sz w:val="14"/>
-                <w:szCs w:val="14"/>
+              <w:top w:w="28" w:type="dxa"/>
+              <w:left w:w="28" w:type="dxa"/>
+              <w:bottom w:w="28" w:type="dxa"/>
+              <w:right w:w="28" w:type="dxa"/>
+            </w:tcMar>
+            <w:vAlign w:val="center"/>
+          </w:tcPr>
+          <w:p>
+            <w:pPr>
+              <w:rPr>
+                <w:sz w:val="12"/>
+                <w:szCs w:val="12"/>
+              </w:rPr>
+            </w:pPr>
+            <w:r>
+              <w:rPr>
+                <w:color w:val="000000"/>
+                <w:sz w:val="12"/>
+                <w:szCs w:val="12"/>
               </w:rPr>
               <w:t>TL</w:t>
             </w:r>
@@ -985,10 +1059,11 @@
       <w:tr>
         <w:trPr>
           <w:trHeight w:val="106"/>
+          <w:jc w:val="center"/>
         </w:trPr>
         <w:tc>
           <w:tcPr>
-            <w:tcW w:w="2835" w:type="dxa"/>
+            <w:tcW w:w="2127" w:type="dxa"/>
             <w:tcBorders>
               <w:top w:val="none" w:sz="0" w:space="0" w:color="FFFFFF"/>
               <w:left w:val="none" w:sz="0" w:space="0" w:color="FFFFFF"/>
@@ -996,25 +1071,25 @@
               <w:right w:val="none" w:sz="0" w:space="0" w:color="FFFFFF"/>
             </w:tcBorders>
             <w:tcMar>
-              <w:top w:w="80" w:type="dxa"/>
-              <w:left w:w="120" w:type="dxa"/>
-              <w:bottom w:w="80" w:type="dxa"/>
-              <w:right w:w="120" w:type="dxa"/>
-            </w:tcMar>
-            <w:vAlign w:val="center"/>
-          </w:tcPr>
-          <w:p>
-            <w:pPr>
-              <w:rPr>
-                <w:sz w:val="14"/>
-                <w:szCs w:val="14"/>
-              </w:rPr>
-            </w:pPr>
-          </w:p>
-        </w:tc>
-        <w:tc>
-          <w:tcPr>
-            <w:tcW w:w="2127" w:type="dxa"/>
+              <w:top w:w="28" w:type="dxa"/>
+              <w:left w:w="28" w:type="dxa"/>
+              <w:bottom w:w="28" w:type="dxa"/>
+              <w:right w:w="28" w:type="dxa"/>
+            </w:tcMar>
+            <w:vAlign w:val="center"/>
+          </w:tcPr>
+          <w:p>
+            <w:pPr>
+              <w:rPr>
+                <w:sz w:val="12"/>
+                <w:szCs w:val="12"/>
+              </w:rPr>
+            </w:pPr>
+          </w:p>
+        </w:tc>
+        <w:tc>
+          <w:tcPr>
+            <w:tcW w:w="1417" w:type="dxa"/>
             <w:tcBorders>
               <w:top w:val="none" w:sz="0" w:space="0" w:color="FFFFFF"/>
               <w:left w:val="none" w:sz="0" w:space="0" w:color="FFFFFF"/>
@@ -1022,25 +1097,25 @@
               <w:right w:val="none" w:sz="0" w:space="0" w:color="FFFFFF"/>
             </w:tcBorders>
             <w:tcMar>
-              <w:top w:w="80" w:type="dxa"/>
-              <w:left w:w="120" w:type="dxa"/>
-              <w:bottom w:w="80" w:type="dxa"/>
-              <w:right w:w="120" w:type="dxa"/>
-            </w:tcMar>
-            <w:vAlign w:val="center"/>
-          </w:tcPr>
-          <w:p>
-            <w:pPr>
-              <w:rPr>
-                <w:sz w:val="14"/>
-                <w:szCs w:val="14"/>
-              </w:rPr>
-            </w:pPr>
-          </w:p>
-        </w:tc>
-        <w:tc>
-          <w:tcPr>
-            <w:tcW w:w="1134" w:type="dxa"/>
+              <w:top w:w="28" w:type="dxa"/>
+              <w:left w:w="28" w:type="dxa"/>
+              <w:bottom w:w="28" w:type="dxa"/>
+              <w:right w:w="28" w:type="dxa"/>
+            </w:tcMar>
+            <w:vAlign w:val="center"/>
+          </w:tcPr>
+          <w:p>
+            <w:pPr>
+              <w:rPr>
+                <w:sz w:val="12"/>
+                <w:szCs w:val="12"/>
+              </w:rPr>
+            </w:pPr>
+          </w:p>
+        </w:tc>
+        <w:tc>
+          <w:tcPr>
+            <w:tcW w:w="851" w:type="dxa"/>
             <w:tcBorders>
               <w:top w:val="none" w:sz="0" w:space="0" w:color="FFFFFF"/>
               <w:left w:val="none" w:sz="0" w:space="0" w:color="FFFFFF"/>
@@ -1048,25 +1123,25 @@
               <w:right w:val="none" w:sz="0" w:space="0" w:color="FFFFFF"/>
             </w:tcBorders>
             <w:tcMar>
-              <w:top w:w="80" w:type="dxa"/>
-              <w:left w:w="120" w:type="dxa"/>
-              <w:bottom w:w="80" w:type="dxa"/>
-              <w:right w:w="120" w:type="dxa"/>
-            </w:tcMar>
-            <w:vAlign w:val="center"/>
-          </w:tcPr>
-          <w:p>
-            <w:pPr>
-              <w:rPr>
-                <w:sz w:val="14"/>
-                <w:szCs w:val="14"/>
-              </w:rPr>
-            </w:pPr>
-          </w:p>
-        </w:tc>
-        <w:tc>
-          <w:tcPr>
-            <w:tcW w:w="1275" w:type="dxa"/>
+              <w:top w:w="28" w:type="dxa"/>
+              <w:left w:w="28" w:type="dxa"/>
+              <w:bottom w:w="28" w:type="dxa"/>
+              <w:right w:w="28" w:type="dxa"/>
+            </w:tcMar>
+            <w:vAlign w:val="center"/>
+          </w:tcPr>
+          <w:p>
+            <w:pPr>
+              <w:rPr>
+                <w:sz w:val="12"/>
+                <w:szCs w:val="12"/>
+              </w:rPr>
+            </w:pPr>
+          </w:p>
+        </w:tc>
+        <w:tc>
+          <w:tcPr>
+            <w:tcW w:w="850" w:type="dxa"/>
             <w:tcBorders>
               <w:top w:val="none" w:sz="0" w:space="0" w:color="FFFFFF"/>
               <w:left w:val="none" w:sz="0" w:space="0" w:color="FFFFFF"/>
@@ -1074,25 +1149,25 @@
               <w:right w:val="none" w:sz="0" w:space="0" w:color="FFFFFF"/>
             </w:tcBorders>
             <w:tcMar>
-              <w:top w:w="80" w:type="dxa"/>
-              <w:left w:w="120" w:type="dxa"/>
-              <w:bottom w:w="80" w:type="dxa"/>
-              <w:right w:w="120" w:type="dxa"/>
-            </w:tcMar>
-            <w:vAlign w:val="center"/>
-          </w:tcPr>
-          <w:p>
-            <w:pPr>
-              <w:rPr>
-                <w:sz w:val="14"/>
-                <w:szCs w:val="14"/>
-              </w:rPr>
-            </w:pPr>
-          </w:p>
-        </w:tc>
-        <w:tc>
-          <w:tcPr>
-            <w:tcW w:w="1544" w:type="dxa"/>
+              <w:top w:w="28" w:type="dxa"/>
+              <w:left w:w="28" w:type="dxa"/>
+              <w:bottom w:w="28" w:type="dxa"/>
+              <w:right w:w="28" w:type="dxa"/>
+            </w:tcMar>
+            <w:vAlign w:val="center"/>
+          </w:tcPr>
+          <w:p>
+            <w:pPr>
+              <w:rPr>
+                <w:sz w:val="12"/>
+                <w:szCs w:val="12"/>
+              </w:rPr>
+            </w:pPr>
+          </w:p>
+        </w:tc>
+        <w:tc>
+          <w:tcPr>
+            <w:tcW w:w="1042" w:type="dxa"/>
             <w:tcBorders>
               <w:top w:val="none" w:sz="0" w:space="0" w:color="FFFFFF"/>
               <w:left w:val="none" w:sz="0" w:space="0" w:color="FFFFFF"/>
@@ -1100,25 +1175,25 @@
               <w:right w:val="none" w:sz="0" w:space="0" w:color="FFFFFF"/>
             </w:tcBorders>
             <w:tcMar>
-              <w:top w:w="80" w:type="dxa"/>
-              <w:left w:w="120" w:type="dxa"/>
-              <w:bottom w:w="80" w:type="dxa"/>
-              <w:right w:w="120" w:type="dxa"/>
-            </w:tcMar>
-            <w:vAlign w:val="center"/>
-          </w:tcPr>
-          <w:p>
-            <w:pPr>
-              <w:rPr>
-                <w:sz w:val="14"/>
-                <w:szCs w:val="14"/>
-              </w:rPr>
-            </w:pPr>
-          </w:p>
-        </w:tc>
-        <w:tc>
-          <w:tcPr>
-            <w:tcW w:w="1382" w:type="dxa"/>
+              <w:top w:w="28" w:type="dxa"/>
+              <w:left w:w="28" w:type="dxa"/>
+              <w:bottom w:w="28" w:type="dxa"/>
+              <w:right w:w="28" w:type="dxa"/>
+            </w:tcMar>
+            <w:vAlign w:val="center"/>
+          </w:tcPr>
+          <w:p>
+            <w:pPr>
+              <w:rPr>
+                <w:sz w:val="12"/>
+                <w:szCs w:val="12"/>
+              </w:rPr>
+            </w:pPr>
+          </w:p>
+        </w:tc>
+        <w:tc>
+          <w:tcPr>
+            <w:tcW w:w="903" w:type="dxa"/>
             <w:tcBorders>
               <w:top w:val="none" w:sz="0" w:space="0" w:color="FFFFFF"/>
               <w:left w:val="none" w:sz="0" w:space="0" w:color="FFFFFF"/>
@@ -1126,10 +1201,10 @@
               <w:right w:val="none" w:sz="0" w:space="0" w:color="FFFFFF"/>
             </w:tcBorders>
             <w:tcMar>
-              <w:top w:w="80" w:type="dxa"/>
-              <w:left w:w="120" w:type="dxa"/>
-              <w:bottom w:w="80" w:type="dxa"/>
-              <w:right w:w="120" w:type="dxa"/>
+              <w:top w:w="28" w:type="dxa"/>
+              <w:left w:w="28" w:type="dxa"/>
+              <w:bottom w:w="28" w:type="dxa"/>
+              <w:right w:w="28" w:type="dxa"/>
             </w:tcMar>
             <w:vAlign w:val="center"/>
           </w:tcPr>
@@ -1137,15 +1212,15 @@
             <w:pPr>
               <w:jc w:val="center"/>
               <w:rPr>
-                <w:sz w:val="14"/>
-                <w:szCs w:val="14"/>
-              </w:rPr>
-            </w:pPr>
-          </w:p>
-        </w:tc>
-        <w:tc>
-          <w:tcPr>
-            <w:tcW w:w="1689" w:type="dxa"/>
+                <w:sz w:val="12"/>
+                <w:szCs w:val="12"/>
+              </w:rPr>
+            </w:pPr>
+          </w:p>
+        </w:tc>
+        <w:tc>
+          <w:tcPr>
+            <w:tcW w:w="1193" w:type="dxa"/>
             <w:tcBorders>
               <w:top w:val="none" w:sz="0" w:space="0" w:color="FFFFFF"/>
               <w:left w:val="none" w:sz="0" w:space="0" w:color="FFFFFF"/>
@@ -1153,10 +1228,10 @@
               <w:right w:val="none" w:sz="0" w:space="0" w:color="FFFFFF"/>
             </w:tcBorders>
             <w:tcMar>
-              <w:top w:w="80" w:type="dxa"/>
-              <w:left w:w="120" w:type="dxa"/>
-              <w:bottom w:w="80" w:type="dxa"/>
-              <w:right w:w="120" w:type="dxa"/>
+              <w:top w:w="28" w:type="dxa"/>
+              <w:left w:w="28" w:type="dxa"/>
+              <w:bottom w:w="28" w:type="dxa"/>
+              <w:right w:w="28" w:type="dxa"/>
             </w:tcMar>
             <w:vAlign w:val="center"/>
           </w:tcPr>
@@ -1166,16 +1241,16 @@
               <w:rPr>
                 <w:b/>
                 <w:bCs/>
-                <w:sz w:val="14"/>
-                <w:szCs w:val="14"/>
-              </w:rPr>
-            </w:pPr>
-            <w:r>
-              <w:rPr>
-                <w:b/>
-                <w:bCs/>
-                <w:sz w:val="14"/>
-                <w:szCs w:val="14"/>
+                <w:sz w:val="12"/>
+                <w:szCs w:val="12"/>
+              </w:rPr>
+            </w:pPr>
+            <w:r>
+              <w:rPr>
+                <w:b/>
+                <w:bCs/>
+                <w:sz w:val="12"/>
+                <w:szCs w:val="12"/>
               </w:rPr>
               <w:t>Toplam</w:t>
             </w:r>
@@ -1183,18 +1258,18 @@
         </w:tc>
         <w:tc>
           <w:tcPr>
-            <w:tcW w:w="1802" w:type="dxa"/>
-            <w:tcBorders>
-              <w:top w:val="single" w:sz="4" w:space="0" w:color="000000"/>
-              <w:left w:val="single" w:sz="4" w:space="0" w:color="000000"/>
-              <w:bottom w:val="single" w:sz="4" w:space="0" w:color="000000"/>
-              <w:right w:val="single" w:sz="4" w:space="0" w:color="000000"/>
-            </w:tcBorders>
-            <w:tcMar>
-              <w:top w:w="80" w:type="dxa"/>
-              <w:left w:w="120" w:type="dxa"/>
-              <w:bottom w:w="80" w:type="dxa"/>
-              <w:right w:w="120" w:type="dxa"/>
+            <w:tcW w:w="1270" w:type="dxa"/>
+            <w:tcBorders>
+              <w:top w:val="single" w:sz="4" w:space="0" w:color="000000"/>
+              <w:left w:val="single" w:sz="4" w:space="0" w:color="000000"/>
+              <w:bottom w:val="single" w:sz="4" w:space="0" w:color="000000"/>
+              <w:right w:val="single" w:sz="4" w:space="0" w:color="000000"/>
+            </w:tcBorders>
+            <w:tcMar>
+              <w:top w:w="28" w:type="dxa"/>
+              <w:left w:w="28" w:type="dxa"/>
+              <w:bottom w:w="28" w:type="dxa"/>
+              <w:right w:w="28" w:type="dxa"/>
             </w:tcMar>
             <w:vAlign w:val="center"/>
           </w:tcPr>
@@ -1202,17 +1277,17 @@
             <w:pPr>
               <w:jc w:val="right"/>
               <w:rPr>
-                <w:sz w:val="14"/>
-                <w:szCs w:val="14"/>
-              </w:rPr>
-            </w:pPr>
-            <w:r>
-              <w:rPr>
-                <w:b/>
-                <w:bCs/>
-                <w:color w:val="000000"/>
-                <w:sz w:val="14"/>
-                <w:szCs w:val="14"/>
+                <w:sz w:val="12"/>
+                <w:szCs w:val="12"/>
+              </w:rPr>
+            </w:pPr>
+            <w:r>
+              <w:rPr>
+                <w:b/>
+                <w:bCs/>
+                <w:color w:val="000000"/>
+                <w:sz w:val="12"/>
+                <w:szCs w:val="12"/>
               </w:rPr>
               <w:t>617.526,00</w:t>
             </w:r>
@@ -1220,7 +1295,7 @@
         </w:tc>
         <w:tc>
           <w:tcPr>
-            <w:tcW w:w="1096" w:type="dxa"/>
+            <w:tcW w:w="813" w:type="dxa"/>
             <w:gridSpan w:val="2"/>
             <w:tcBorders>
               <w:top w:val="single" w:sz="4" w:space="0" w:color="000000"/>
@@ -1229,27 +1304,27 @@
               <w:right w:val="single" w:sz="4" w:space="0" w:color="000000"/>
             </w:tcBorders>
             <w:tcMar>
-              <w:top w:w="80" w:type="dxa"/>
-              <w:left w:w="120" w:type="dxa"/>
-              <w:bottom w:w="80" w:type="dxa"/>
-              <w:right w:w="120" w:type="dxa"/>
-            </w:tcMar>
-            <w:vAlign w:val="center"/>
-          </w:tcPr>
-          <w:p>
-            <w:pPr>
-              <w:rPr>
-                <w:sz w:val="14"/>
-                <w:szCs w:val="14"/>
-              </w:rPr>
-            </w:pPr>
-            <w:r>
-              <w:rPr>
-                <w:b/>
-                <w:bCs/>
-                <w:color w:val="000000"/>
-                <w:sz w:val="14"/>
-                <w:szCs w:val="14"/>
+              <w:top w:w="28" w:type="dxa"/>
+              <w:left w:w="28" w:type="dxa"/>
+              <w:bottom w:w="28" w:type="dxa"/>
+              <w:right w:w="28" w:type="dxa"/>
+            </w:tcMar>
+            <w:vAlign w:val="center"/>
+          </w:tcPr>
+          <w:p>
+            <w:pPr>
+              <w:rPr>
+                <w:sz w:val="12"/>
+                <w:szCs w:val="12"/>
+              </w:rPr>
+            </w:pPr>
+            <w:r>
+              <w:rPr>
+                <w:b/>
+                <w:bCs/>
+                <w:color w:val="000000"/>
+                <w:sz w:val="12"/>
+                <w:szCs w:val="12"/>
               </w:rPr>
               <w:t>TL</w:t>
             </w:r>
@@ -1260,7 +1335,8 @@
     <w:p/>
     <w:tbl>
       <w:tblPr>
-        <w:tblW w:w="11907" w:type="dxa"/>
+        <w:tblW w:w="0" w:type="auto"/>
+        <w:jc w:val="center"/>
         <w:tblBorders>
           <w:top w:val="single" w:sz="4" w:space="0" w:color="auto"/>
           <w:left w:val="single" w:sz="4" w:space="0" w:color="auto"/>
@@ -1276,23 +1352,23 @@
         <w:tblLook w:val="0000" w:firstRow="0" w:lastRow="0" w:firstColumn="0" w:lastColumn="0" w:noHBand="0" w:noVBand="0"/>
       </w:tblPr>
       <w:tblGrid>
-        <w:gridCol w:w="2835"/>
         <w:gridCol w:w="2127"/>
-        <w:gridCol w:w="1134"/>
+        <w:gridCol w:w="1417"/>
+        <w:gridCol w:w="1418"/>
         <w:gridCol w:w="1275"/>
-        <w:gridCol w:w="1560"/>
-        <w:gridCol w:w="1417"/>
-        <w:gridCol w:w="160"/>
-        <w:gridCol w:w="1399"/>
+        <w:gridCol w:w="1418"/>
+        <w:gridCol w:w="1413"/>
+        <w:gridCol w:w="1398"/>
       </w:tblGrid>
       <w:tr>
         <w:trPr>
           <w:trHeight w:val="237"/>
+          <w:jc w:val="center"/>
         </w:trPr>
         <w:tc>
           <w:tcPr>
-            <w:tcW w:w="11907" w:type="dxa"/>
-            <w:gridSpan w:val="8"/>
+            <w:tcW w:w="10466" w:type="dxa"/>
+            <w:gridSpan w:val="7"/>
             <w:tcBorders>
               <w:top w:val="none" w:sz="0" w:space="0" w:color="FFFFFF"/>
               <w:left w:val="none" w:sz="0" w:space="0" w:color="FFFFFF"/>
@@ -1330,10 +1406,11 @@
       <w:tr>
         <w:trPr>
           <w:trHeight w:val="276"/>
+          <w:jc w:val="center"/>
         </w:trPr>
         <w:tc>
           <w:tcPr>
-            <w:tcW w:w="2835" w:type="dxa"/>
+            <w:tcW w:w="2127" w:type="dxa"/>
             <w:tcBorders>
               <w:top w:val="single" w:sz="4" w:space="0" w:color="000000"/>
               <w:left w:val="single" w:sz="4" w:space="0" w:color="000000"/>
@@ -1353,17 +1430,17 @@
             <w:pPr>
               <w:jc w:val="center"/>
               <w:rPr>
-                <w:sz w:val="14"/>
-                <w:szCs w:val="14"/>
-              </w:rPr>
-            </w:pPr>
-            <w:r>
-              <w:rPr>
-                <w:b/>
-                <w:bCs/>
-                <w:color w:val="000000"/>
-                <w:sz w:val="14"/>
-                <w:szCs w:val="14"/>
+                <w:sz w:val="12"/>
+                <w:szCs w:val="12"/>
+              </w:rPr>
+            </w:pPr>
+            <w:r>
+              <w:rPr>
+                <w:b/>
+                <w:bCs/>
+                <w:color w:val="000000"/>
+                <w:sz w:val="12"/>
+                <w:szCs w:val="12"/>
               </w:rPr>
               <w:t>Kira Planı No</w:t>
             </w:r>
@@ -1371,7 +1448,7 @@
         </w:tc>
         <w:tc>
           <w:tcPr>
-            <w:tcW w:w="2127" w:type="dxa"/>
+            <w:tcW w:w="1417" w:type="dxa"/>
             <w:tcBorders>
               <w:top w:val="single" w:sz="4" w:space="0" w:color="000000"/>
               <w:left w:val="single" w:sz="4" w:space="0" w:color="000000"/>
@@ -1391,17 +1468,17 @@
             <w:pPr>
               <w:jc w:val="center"/>
               <w:rPr>
-                <w:sz w:val="14"/>
-                <w:szCs w:val="14"/>
-              </w:rPr>
-            </w:pPr>
-            <w:r>
-              <w:rPr>
-                <w:b/>
-                <w:bCs/>
-                <w:color w:val="000000"/>
-                <w:sz w:val="14"/>
-                <w:szCs w:val="14"/>
+                <w:sz w:val="12"/>
+                <w:szCs w:val="12"/>
+              </w:rPr>
+            </w:pPr>
+            <w:r>
+              <w:rPr>
+                <w:b/>
+                <w:bCs/>
+                <w:color w:val="000000"/>
+                <w:sz w:val="12"/>
+                <w:szCs w:val="12"/>
               </w:rPr>
               <w:t>Hesaplama Tarihi</w:t>
             </w:r>
@@ -1409,7 +1486,7 @@
         </w:tc>
         <w:tc>
           <w:tcPr>
-            <w:tcW w:w="1134" w:type="dxa"/>
+            <w:tcW w:w="1418" w:type="dxa"/>
             <w:tcBorders>
               <w:top w:val="single" w:sz="4" w:space="0" w:color="000000"/>
               <w:left w:val="single" w:sz="4" w:space="0" w:color="000000"/>
@@ -1429,17 +1506,17 @@
             <w:pPr>
               <w:jc w:val="center"/>
               <w:rPr>
-                <w:sz w:val="14"/>
-                <w:szCs w:val="14"/>
-              </w:rPr>
-            </w:pPr>
-            <w:r>
-              <w:rPr>
-                <w:b/>
-                <w:bCs/>
-                <w:color w:val="000000"/>
-                <w:sz w:val="14"/>
-                <w:szCs w:val="14"/>
+                <w:sz w:val="12"/>
+                <w:szCs w:val="12"/>
+              </w:rPr>
+            </w:pPr>
+            <w:r>
+              <w:rPr>
+                <w:b/>
+                <w:bCs/>
+                <w:color w:val="000000"/>
+                <w:sz w:val="12"/>
+                <w:szCs w:val="12"/>
               </w:rPr>
               <w:t>Gecikme Gün Sayısı</w:t>
             </w:r>
@@ -1467,17 +1544,17 @@
             <w:pPr>
               <w:jc w:val="center"/>
               <w:rPr>
-                <w:sz w:val="14"/>
-                <w:szCs w:val="14"/>
-              </w:rPr>
-            </w:pPr>
-            <w:r>
-              <w:rPr>
-                <w:b/>
-                <w:bCs/>
-                <w:color w:val="000000"/>
-                <w:sz w:val="14"/>
-                <w:szCs w:val="14"/>
+                <w:sz w:val="12"/>
+                <w:szCs w:val="12"/>
+              </w:rPr>
+            </w:pPr>
+            <w:r>
+              <w:rPr>
+                <w:b/>
+                <w:bCs/>
+                <w:color w:val="000000"/>
+                <w:sz w:val="12"/>
+                <w:szCs w:val="12"/>
               </w:rPr>
               <w:t>İleri Vadeli Kira</w:t>
             </w:r>
@@ -1485,7 +1562,7 @@
         </w:tc>
         <w:tc>
           <w:tcPr>
-            <w:tcW w:w="1560" w:type="dxa"/>
+            <w:tcW w:w="1418" w:type="dxa"/>
             <w:tcBorders>
               <w:top w:val="single" w:sz="4" w:space="0" w:color="000000"/>
               <w:left w:val="single" w:sz="4" w:space="0" w:color="000000"/>
@@ -1505,17 +1582,17 @@
             <w:pPr>
               <w:jc w:val="center"/>
               <w:rPr>
-                <w:sz w:val="14"/>
-                <w:szCs w:val="14"/>
-              </w:rPr>
-            </w:pPr>
-            <w:r>
-              <w:rPr>
-                <w:b/>
-                <w:bCs/>
-                <w:color w:val="000000"/>
-                <w:sz w:val="14"/>
-                <w:szCs w:val="14"/>
+                <w:sz w:val="12"/>
+                <w:szCs w:val="12"/>
+              </w:rPr>
+            </w:pPr>
+            <w:r>
+              <w:rPr>
+                <w:b/>
+                <w:bCs/>
+                <w:color w:val="000000"/>
+                <w:sz w:val="12"/>
+                <w:szCs w:val="12"/>
               </w:rPr>
               <w:t>Geciken Borç (KDV Dahil)</w:t>
             </w:r>
@@ -1523,7 +1600,7 @@
         </w:tc>
         <w:tc>
           <w:tcPr>
-            <w:tcW w:w="1417" w:type="dxa"/>
+            <w:tcW w:w="1413" w:type="dxa"/>
             <w:tcBorders>
               <w:top w:val="single" w:sz="4" w:space="0" w:color="000000"/>
               <w:left w:val="single" w:sz="4" w:space="0" w:color="000000"/>
@@ -1543,17 +1620,17 @@
             <w:pPr>
               <w:jc w:val="center"/>
               <w:rPr>
-                <w:sz w:val="14"/>
-                <w:szCs w:val="14"/>
-              </w:rPr>
-            </w:pPr>
-            <w:r>
-              <w:rPr>
-                <w:b/>
-                <w:bCs/>
-                <w:color w:val="000000"/>
-                <w:sz w:val="14"/>
-                <w:szCs w:val="14"/>
+                <w:sz w:val="12"/>
+                <w:szCs w:val="12"/>
+              </w:rPr>
+            </w:pPr>
+            <w:r>
+              <w:rPr>
+                <w:b/>
+                <w:bCs/>
+                <w:color w:val="000000"/>
+                <w:sz w:val="12"/>
+                <w:szCs w:val="12"/>
               </w:rPr>
               <w:t>Toplam Risk</w:t>
             </w:r>
@@ -1561,8 +1638,7 @@
         </w:tc>
         <w:tc>
           <w:tcPr>
-            <w:tcW w:w="1559" w:type="dxa"/>
-            <w:gridSpan w:val="2"/>
+            <w:tcW w:w="1398" w:type="dxa"/>
             <w:tcBorders>
               <w:top w:val="single" w:sz="4" w:space="0" w:color="000000"/>
               <w:left w:val="single" w:sz="4" w:space="0" w:color="000000"/>
@@ -1582,17 +1658,17 @@
             <w:pPr>
               <w:jc w:val="center"/>
               <w:rPr>
-                <w:sz w:val="14"/>
-                <w:szCs w:val="14"/>
-              </w:rPr>
-            </w:pPr>
-            <w:r>
-              <w:rPr>
-                <w:b/>
-                <w:bCs/>
-                <w:color w:val="000000"/>
-                <w:sz w:val="14"/>
-                <w:szCs w:val="14"/>
+                <w:sz w:val="12"/>
+                <w:szCs w:val="12"/>
+              </w:rPr>
+            </w:pPr>
+            <w:r>
+              <w:rPr>
+                <w:b/>
+                <w:bCs/>
+                <w:color w:val="000000"/>
+                <w:sz w:val="12"/>
+                <w:szCs w:val="12"/>
               </w:rPr>
               <w:t>Toplam Tahsilat</w:t>
             </w:r>
@@ -1602,36 +1678,37 @@
       <w:tr>
         <w:trPr>
           <w:trHeight w:val="219"/>
+          <w:jc w:val="center"/>
         </w:trPr>
         <w:tc>
           <w:tcPr>
-            <w:tcW w:w="2835" w:type="dxa"/>
-            <w:tcBorders>
-              <w:top w:val="single" w:sz="4" w:space="0" w:color="000000"/>
-              <w:left w:val="single" w:sz="4" w:space="0" w:color="000000"/>
-              <w:bottom w:val="single" w:sz="4" w:space="0" w:color="000000"/>
-              <w:right w:val="single" w:sz="4" w:space="0" w:color="000000"/>
-            </w:tcBorders>
-            <w:tcMar>
-              <w:top w:w="80" w:type="dxa"/>
-              <w:left w:w="120" w:type="dxa"/>
-              <w:bottom w:w="80" w:type="dxa"/>
-              <w:right w:w="120" w:type="dxa"/>
-            </w:tcMar>
-            <w:vAlign w:val="center"/>
-          </w:tcPr>
-          <w:p>
-            <w:pPr>
-              <w:rPr>
-                <w:sz w:val="14"/>
-                <w:szCs w:val="14"/>
-              </w:rPr>
-            </w:pPr>
-            <w:r>
-              <w:rPr>
-                <w:color w:val="000000"/>
-                <w:sz w:val="14"/>
-                <w:szCs w:val="14"/>
+            <w:tcW w:w="2127" w:type="dxa"/>
+            <w:tcBorders>
+              <w:top w:val="single" w:sz="4" w:space="0" w:color="000000"/>
+              <w:left w:val="single" w:sz="4" w:space="0" w:color="000000"/>
+              <w:bottom w:val="single" w:sz="4" w:space="0" w:color="000000"/>
+              <w:right w:val="single" w:sz="4" w:space="0" w:color="000000"/>
+            </w:tcBorders>
+            <w:tcMar>
+              <w:top w:w="80" w:type="dxa"/>
+              <w:left w:w="120" w:type="dxa"/>
+              <w:bottom w:w="80" w:type="dxa"/>
+              <w:right w:w="120" w:type="dxa"/>
+            </w:tcMar>
+            <w:vAlign w:val="center"/>
+          </w:tcPr>
+          <w:p>
+            <w:pPr>
+              <w:rPr>
+                <w:sz w:val="12"/>
+                <w:szCs w:val="12"/>
+              </w:rPr>
+            </w:pPr>
+            <w:r>
+              <w:rPr>
+                <w:color w:val="000000"/>
+                <w:sz w:val="12"/>
+                <w:szCs w:val="12"/>
               </w:rPr>
               <w:t>67480</w:t>
             </w:r>
@@ -1639,33 +1716,33 @@
         </w:tc>
         <w:tc>
           <w:tcPr>
-            <w:tcW w:w="2127" w:type="dxa"/>
-            <w:tcBorders>
-              <w:top w:val="single" w:sz="4" w:space="0" w:color="000000"/>
-              <w:left w:val="single" w:sz="4" w:space="0" w:color="000000"/>
-              <w:bottom w:val="single" w:sz="4" w:space="0" w:color="000000"/>
-              <w:right w:val="single" w:sz="4" w:space="0" w:color="000000"/>
-            </w:tcBorders>
-            <w:tcMar>
-              <w:top w:w="80" w:type="dxa"/>
-              <w:left w:w="120" w:type="dxa"/>
-              <w:bottom w:w="80" w:type="dxa"/>
-              <w:right w:w="120" w:type="dxa"/>
-            </w:tcMar>
-            <w:vAlign w:val="center"/>
-          </w:tcPr>
-          <w:p>
-            <w:pPr>
-              <w:rPr>
-                <w:sz w:val="14"/>
-                <w:szCs w:val="14"/>
-              </w:rPr>
-            </w:pPr>
-            <w:r>
-              <w:rPr>
-                <w:color w:val="000000"/>
-                <w:sz w:val="14"/>
-                <w:szCs w:val="14"/>
+            <w:tcW w:w="1417" w:type="dxa"/>
+            <w:tcBorders>
+              <w:top w:val="single" w:sz="4" w:space="0" w:color="000000"/>
+              <w:left w:val="single" w:sz="4" w:space="0" w:color="000000"/>
+              <w:bottom w:val="single" w:sz="4" w:space="0" w:color="000000"/>
+              <w:right w:val="single" w:sz="4" w:space="0" w:color="000000"/>
+            </w:tcBorders>
+            <w:tcMar>
+              <w:top w:w="80" w:type="dxa"/>
+              <w:left w:w="120" w:type="dxa"/>
+              <w:bottom w:w="80" w:type="dxa"/>
+              <w:right w:w="120" w:type="dxa"/>
+            </w:tcMar>
+            <w:vAlign w:val="center"/>
+          </w:tcPr>
+          <w:p>
+            <w:pPr>
+              <w:rPr>
+                <w:sz w:val="12"/>
+                <w:szCs w:val="12"/>
+              </w:rPr>
+            </w:pPr>
+            <w:r>
+              <w:rPr>
+                <w:color w:val="000000"/>
+                <w:sz w:val="12"/>
+                <w:szCs w:val="12"/>
               </w:rPr>
               <w:t>10.06.2026</w:t>
             </w:r>
@@ -1673,33 +1750,33 @@
         </w:tc>
         <w:tc>
           <w:tcPr>
-            <w:tcW w:w="1134" w:type="dxa"/>
-            <w:tcBorders>
-              <w:top w:val="single" w:sz="4" w:space="0" w:color="000000"/>
-              <w:left w:val="single" w:sz="4" w:space="0" w:color="000000"/>
-              <w:bottom w:val="single" w:sz="4" w:space="0" w:color="000000"/>
-              <w:right w:val="single" w:sz="4" w:space="0" w:color="000000"/>
-            </w:tcBorders>
-            <w:tcMar>
-              <w:top w:w="80" w:type="dxa"/>
-              <w:left w:w="120" w:type="dxa"/>
-              <w:bottom w:w="80" w:type="dxa"/>
-              <w:right w:w="120" w:type="dxa"/>
-            </w:tcMar>
-            <w:vAlign w:val="center"/>
-          </w:tcPr>
-          <w:p>
-            <w:pPr>
-              <w:rPr>
-                <w:sz w:val="14"/>
-                <w:szCs w:val="14"/>
-              </w:rPr>
-            </w:pPr>
-            <w:r>
-              <w:rPr>
-                <w:color w:val="000000"/>
-                <w:sz w:val="14"/>
-                <w:szCs w:val="14"/>
+            <w:tcW w:w="1418" w:type="dxa"/>
+            <w:tcBorders>
+              <w:top w:val="single" w:sz="4" w:space="0" w:color="000000"/>
+              <w:left w:val="single" w:sz="4" w:space="0" w:color="000000"/>
+              <w:bottom w:val="single" w:sz="4" w:space="0" w:color="000000"/>
+              <w:right w:val="single" w:sz="4" w:space="0" w:color="000000"/>
+            </w:tcBorders>
+            <w:tcMar>
+              <w:top w:w="80" w:type="dxa"/>
+              <w:left w:w="120" w:type="dxa"/>
+              <w:bottom w:w="80" w:type="dxa"/>
+              <w:right w:w="120" w:type="dxa"/>
+            </w:tcMar>
+            <w:vAlign w:val="center"/>
+          </w:tcPr>
+          <w:p>
+            <w:pPr>
+              <w:rPr>
+                <w:sz w:val="12"/>
+                <w:szCs w:val="12"/>
+              </w:rPr>
+            </w:pPr>
+            <w:r>
+              <w:rPr>
+                <w:color w:val="000000"/>
+                <w:sz w:val="12"/>
+                <w:szCs w:val="12"/>
               </w:rPr>
               <w:t>115</w:t>
             </w:r>
@@ -1726,15 +1803,15 @@
             <w:pPr>
               <w:jc w:val="right"/>
               <w:rPr>
-                <w:sz w:val="14"/>
-                <w:szCs w:val="14"/>
-              </w:rPr>
-            </w:pPr>
-            <w:r>
-              <w:rPr>
-                <w:color w:val="000000"/>
-                <w:sz w:val="14"/>
-                <w:szCs w:val="14"/>
+                <w:sz w:val="12"/>
+                <w:szCs w:val="12"/>
+              </w:rPr>
+            </w:pPr>
+            <w:r>
+              <w:rPr>
+                <w:color w:val="000000"/>
+                <w:sz w:val="12"/>
+                <w:szCs w:val="12"/>
               </w:rPr>
               <w:t>444.618,72</w:t>
             </w:r>
@@ -1742,7 +1819,7 @@
         </w:tc>
         <w:tc>
           <w:tcPr>
-            <w:tcW w:w="1560" w:type="dxa"/>
+            <w:tcW w:w="1418" w:type="dxa"/>
             <w:tcBorders>
               <w:top w:val="single" w:sz="4" w:space="0" w:color="000000"/>
               <w:left w:val="single" w:sz="4" w:space="0" w:color="000000"/>
@@ -1761,15 +1838,15 @@
             <w:pPr>
               <w:jc w:val="right"/>
               <w:rPr>
-                <w:sz w:val="14"/>
-                <w:szCs w:val="14"/>
-              </w:rPr>
-            </w:pPr>
-            <w:r>
-              <w:rPr>
-                <w:color w:val="000000"/>
-                <w:sz w:val="14"/>
-                <w:szCs w:val="14"/>
+                <w:sz w:val="12"/>
+                <w:szCs w:val="12"/>
+              </w:rPr>
+            </w:pPr>
+            <w:r>
+              <w:rPr>
+                <w:color w:val="000000"/>
+                <w:sz w:val="12"/>
+                <w:szCs w:val="12"/>
               </w:rPr>
               <w:t>49.402,08</w:t>
             </w:r>
@@ -1777,8 +1854,7 @@
         </w:tc>
         <w:tc>
           <w:tcPr>
-            <w:tcW w:w="1577" w:type="dxa"/>
-            <w:gridSpan w:val="2"/>
+            <w:tcW w:w="1413" w:type="dxa"/>
             <w:tcBorders>
               <w:top w:val="single" w:sz="4" w:space="0" w:color="000000"/>
               <w:left w:val="single" w:sz="4" w:space="0" w:color="000000"/>
@@ -1797,17 +1873,17 @@
             <w:pPr>
               <w:jc w:val="right"/>
               <w:rPr>
-                <w:sz w:val="14"/>
-                <w:szCs w:val="14"/>
-              </w:rPr>
-            </w:pPr>
-            <w:r>
-              <w:rPr>
-                <w:b/>
-                <w:bCs/>
-                <w:color w:val="000000"/>
-                <w:sz w:val="14"/>
-                <w:szCs w:val="14"/>
+                <w:sz w:val="12"/>
+                <w:szCs w:val="12"/>
+              </w:rPr>
+            </w:pPr>
+            <w:r>
+              <w:rPr>
+                <w:b/>
+                <w:bCs/>
+                <w:color w:val="000000"/>
+                <w:sz w:val="12"/>
+                <w:szCs w:val="12"/>
               </w:rPr>
               <w:t>494.020,80</w:t>
             </w:r>
@@ -1815,7 +1891,7 @@
         </w:tc>
         <w:tc>
           <w:tcPr>
-            <w:tcW w:w="1399" w:type="dxa"/>
+            <w:tcW w:w="1398" w:type="dxa"/>
             <w:tcBorders>
               <w:top w:val="single" w:sz="4" w:space="0" w:color="000000"/>
               <w:left w:val="single" w:sz="4" w:space="0" w:color="000000"/>
@@ -1834,15 +1910,15 @@
             <w:pPr>
               <w:jc w:val="right"/>
               <w:rPr>
-                <w:sz w:val="14"/>
-                <w:szCs w:val="14"/>
-              </w:rPr>
-            </w:pPr>
-            <w:r>
-              <w:rPr>
-                <w:color w:val="000000"/>
-                <w:sz w:val="14"/>
-                <w:szCs w:val="14"/>
+                <w:sz w:val="12"/>
+                <w:szCs w:val="12"/>
+              </w:rPr>
+            </w:pPr>
+            <w:r>
+              <w:rPr>
+                <w:color w:val="000000"/>
+                <w:sz w:val="12"/>
+                <w:szCs w:val="12"/>
               </w:rPr>
               <w:t>123.505,20</w:t>
             </w:r>
@@ -1852,10 +1928,11 @@
       <w:tr>
         <w:trPr>
           <w:trHeight w:val="219"/>
+          <w:jc w:val="center"/>
         </w:trPr>
         <w:tc>
           <w:tcPr>
-            <w:tcW w:w="2835" w:type="dxa"/>
+            <w:tcW w:w="2127" w:type="dxa"/>
             <w:tcBorders>
               <w:top w:val="none" w:sz="0" w:space="0" w:color="FFFFFF"/>
               <w:left w:val="none" w:sz="0" w:space="0" w:color="FFFFFF"/>
@@ -1873,15 +1950,15 @@
           <w:p>
             <w:pPr>
               <w:rPr>
-                <w:sz w:val="14"/>
-                <w:szCs w:val="14"/>
-              </w:rPr>
-            </w:pPr>
-          </w:p>
-        </w:tc>
-        <w:tc>
-          <w:tcPr>
-            <w:tcW w:w="2127" w:type="dxa"/>
+                <w:sz w:val="12"/>
+                <w:szCs w:val="12"/>
+              </w:rPr>
+            </w:pPr>
+          </w:p>
+        </w:tc>
+        <w:tc>
+          <w:tcPr>
+            <w:tcW w:w="1417" w:type="dxa"/>
             <w:tcBorders>
               <w:top w:val="none" w:sz="0" w:space="0" w:color="FFFFFF"/>
               <w:left w:val="none" w:sz="0" w:space="0" w:color="FFFFFF"/>
@@ -1899,15 +1976,15 @@
           <w:p>
             <w:pPr>
               <w:rPr>
-                <w:sz w:val="14"/>
-                <w:szCs w:val="14"/>
-              </w:rPr>
-            </w:pPr>
-          </w:p>
-        </w:tc>
-        <w:tc>
-          <w:tcPr>
-            <w:tcW w:w="1134" w:type="dxa"/>
+                <w:sz w:val="12"/>
+                <w:szCs w:val="12"/>
+              </w:rPr>
+            </w:pPr>
+          </w:p>
+        </w:tc>
+        <w:tc>
+          <w:tcPr>
+            <w:tcW w:w="1418" w:type="dxa"/>
             <w:tcBorders>
               <w:top w:val="single" w:sz="4" w:space="0" w:color="000000"/>
               <w:left w:val="single" w:sz="4" w:space="0" w:color="000000"/>
@@ -1926,17 +2003,17 @@
             <w:pPr>
               <w:jc w:val="right"/>
               <w:rPr>
-                <w:sz w:val="14"/>
-                <w:szCs w:val="14"/>
-              </w:rPr>
-            </w:pPr>
-            <w:r>
-              <w:rPr>
-                <w:b/>
-                <w:bCs/>
-                <w:color w:val="000000"/>
-                <w:sz w:val="14"/>
-                <w:szCs w:val="14"/>
+                <w:sz w:val="12"/>
+                <w:szCs w:val="12"/>
+              </w:rPr>
+            </w:pPr>
+            <w:r>
+              <w:rPr>
+                <w:b/>
+                <w:bCs/>
+                <w:color w:val="000000"/>
+                <w:sz w:val="12"/>
+                <w:szCs w:val="12"/>
               </w:rPr>
               <w:t>Toplam</w:t>
             </w:r>
@@ -1963,17 +2040,17 @@
             <w:pPr>
               <w:jc w:val="right"/>
               <w:rPr>
-                <w:sz w:val="14"/>
-                <w:szCs w:val="14"/>
-              </w:rPr>
-            </w:pPr>
-            <w:r>
-              <w:rPr>
-                <w:b/>
-                <w:bCs/>
-                <w:color w:val="000000"/>
-                <w:sz w:val="14"/>
-                <w:szCs w:val="14"/>
+                <w:sz w:val="12"/>
+                <w:szCs w:val="12"/>
+              </w:rPr>
+            </w:pPr>
+            <w:r>
+              <w:rPr>
+                <w:b/>
+                <w:bCs/>
+                <w:color w:val="000000"/>
+                <w:sz w:val="12"/>
+                <w:szCs w:val="12"/>
               </w:rPr>
               <w:t>444.618,72</w:t>
             </w:r>
@@ -1981,7 +2058,7 @@
         </w:tc>
         <w:tc>
           <w:tcPr>
-            <w:tcW w:w="1560" w:type="dxa"/>
+            <w:tcW w:w="1418" w:type="dxa"/>
             <w:tcBorders>
               <w:top w:val="single" w:sz="4" w:space="0" w:color="000000"/>
               <w:left w:val="single" w:sz="4" w:space="0" w:color="000000"/>
@@ -2000,17 +2077,17 @@
             <w:pPr>
               <w:jc w:val="right"/>
               <w:rPr>
-                <w:sz w:val="14"/>
-                <w:szCs w:val="14"/>
-              </w:rPr>
-            </w:pPr>
-            <w:r>
-              <w:rPr>
-                <w:b/>
-                <w:bCs/>
-                <w:color w:val="000000"/>
-                <w:sz w:val="14"/>
-                <w:szCs w:val="14"/>
+                <w:sz w:val="12"/>
+                <w:szCs w:val="12"/>
+              </w:rPr>
+            </w:pPr>
+            <w:r>
+              <w:rPr>
+                <w:b/>
+                <w:bCs/>
+                <w:color w:val="000000"/>
+                <w:sz w:val="12"/>
+                <w:szCs w:val="12"/>
               </w:rPr>
               <w:t>49.402,08</w:t>
             </w:r>
@@ -2018,8 +2095,7 @@
         </w:tc>
         <w:tc>
           <w:tcPr>
-            <w:tcW w:w="1577" w:type="dxa"/>
-            <w:gridSpan w:val="2"/>
+            <w:tcW w:w="1413" w:type="dxa"/>
             <w:tcBorders>
               <w:top w:val="single" w:sz="4" w:space="0" w:color="000000"/>
               <w:left w:val="single" w:sz="4" w:space="0" w:color="000000"/>
@@ -2038,17 +2114,17 @@
             <w:pPr>
               <w:jc w:val="right"/>
               <w:rPr>
-                <w:sz w:val="14"/>
-                <w:szCs w:val="14"/>
-              </w:rPr>
-            </w:pPr>
-            <w:r>
-              <w:rPr>
-                <w:b/>
-                <w:bCs/>
-                <w:color w:val="000000"/>
-                <w:sz w:val="14"/>
-                <w:szCs w:val="14"/>
+                <w:sz w:val="12"/>
+                <w:szCs w:val="12"/>
+              </w:rPr>
+            </w:pPr>
+            <w:r>
+              <w:rPr>
+                <w:b/>
+                <w:bCs/>
+                <w:color w:val="000000"/>
+                <w:sz w:val="12"/>
+                <w:szCs w:val="12"/>
               </w:rPr>
               <w:t>494.020,80</w:t>
             </w:r>
@@ -2056,7 +2132,7 @@
         </w:tc>
         <w:tc>
           <w:tcPr>
-            <w:tcW w:w="1399" w:type="dxa"/>
+            <w:tcW w:w="1398" w:type="dxa"/>
             <w:tcBorders>
               <w:top w:val="single" w:sz="4" w:space="0" w:color="000000"/>
               <w:left w:val="single" w:sz="4" w:space="0" w:color="000000"/>
@@ -2075,17 +2151,17 @@
             <w:pPr>
               <w:jc w:val="right"/>
               <w:rPr>
-                <w:sz w:val="14"/>
-                <w:szCs w:val="14"/>
-              </w:rPr>
-            </w:pPr>
-            <w:r>
-              <w:rPr>
-                <w:b/>
-                <w:bCs/>
-                <w:color w:val="000000"/>
-                <w:sz w:val="14"/>
-                <w:szCs w:val="14"/>
+                <w:sz w:val="12"/>
+                <w:szCs w:val="12"/>
+              </w:rPr>
+            </w:pPr>
+            <w:r>
+              <w:rPr>
+                <w:b/>
+                <w:bCs/>
+                <w:color w:val="000000"/>
+                <w:sz w:val="12"/>
+                <w:szCs w:val="12"/>
               </w:rPr>
               <w:t>123.505,20</w:t>
             </w:r>
@@ -2193,8 +2269,8 @@
           <w:p>
             <w:pPr>
               <w:rPr>
-                <w:sz w:val="14"/>
-                <w:szCs w:val="14"/>
+                <w:sz w:val="12"/>
+                <w:szCs w:val="12"/>
               </w:rPr>
             </w:pPr>
           </w:p>
@@ -2220,17 +2296,17 @@
             <w:pPr>
               <w:jc w:val="center"/>
               <w:rPr>
-                <w:sz w:val="14"/>
-                <w:szCs w:val="14"/>
-              </w:rPr>
-            </w:pPr>
-            <w:r>
-              <w:rPr>
-                <w:b/>
-                <w:bCs/>
-                <w:color w:val="000000"/>
-                <w:sz w:val="14"/>
-                <w:szCs w:val="14"/>
+                <w:sz w:val="12"/>
+                <w:szCs w:val="12"/>
+              </w:rPr>
+            </w:pPr>
+            <w:r>
+              <w:rPr>
+                <w:b/>
+                <w:bCs/>
+                <w:color w:val="000000"/>
+                <w:sz w:val="12"/>
+                <w:szCs w:val="12"/>
               </w:rPr>
               <w:t>Kesinti tablosu</w:t>
             </w:r>
@@ -2256,8 +2332,8 @@
           <w:p>
             <w:pPr>
               <w:rPr>
-                <w:sz w:val="14"/>
-                <w:szCs w:val="14"/>
+                <w:sz w:val="12"/>
+                <w:szCs w:val="12"/>
               </w:rPr>
             </w:pPr>
           </w:p>
@@ -2289,17 +2365,17 @@
           <w:p>
             <w:pPr>
               <w:rPr>
-                <w:sz w:val="14"/>
-                <w:szCs w:val="14"/>
-              </w:rPr>
-            </w:pPr>
-            <w:r>
-              <w:rPr>
-                <w:b/>
-                <w:bCs/>
-                <w:color w:val="000000"/>
-                <w:sz w:val="14"/>
-                <w:szCs w:val="14"/>
+                <w:sz w:val="12"/>
+                <w:szCs w:val="12"/>
+              </w:rPr>
+            </w:pPr>
+            <w:r>
+              <w:rPr>
+                <w:b/>
+                <w:bCs/>
+                <w:color w:val="000000"/>
+                <w:sz w:val="12"/>
+                <w:szCs w:val="12"/>
               </w:rPr>
               <w:t>Sözleşme Tutarı</w:t>
             </w:r>
@@ -2326,15 +2402,15 @@
             <w:pPr>
               <w:jc w:val="right"/>
               <w:rPr>
-                <w:sz w:val="14"/>
-                <w:szCs w:val="14"/>
-              </w:rPr>
-            </w:pPr>
-            <w:r>
-              <w:rPr>
-                <w:color w:val="000000"/>
-                <w:sz w:val="14"/>
-                <w:szCs w:val="14"/>
+                <w:sz w:val="12"/>
+                <w:szCs w:val="12"/>
+              </w:rPr>
+            </w:pPr>
+            <w:r>
+              <w:rPr>
+                <w:color w:val="000000"/>
+                <w:sz w:val="12"/>
+                <w:szCs w:val="12"/>
               </w:rPr>
               <w:t>617.526,00</w:t>
             </w:r>
@@ -2360,8 +2436,8 @@
           <w:p>
             <w:pPr>
               <w:rPr>
-                <w:sz w:val="14"/>
-                <w:szCs w:val="14"/>
+                <w:sz w:val="12"/>
+                <w:szCs w:val="12"/>
               </w:rPr>
             </w:pPr>
           </w:p>
@@ -2393,17 +2469,17 @@
           <w:p>
             <w:pPr>
               <w:rPr>
-                <w:sz w:val="14"/>
-                <w:szCs w:val="14"/>
-              </w:rPr>
-            </w:pPr>
-            <w:r>
-              <w:rPr>
-                <w:b/>
-                <w:bCs/>
-                <w:color w:val="000000"/>
-                <w:sz w:val="14"/>
-                <w:szCs w:val="14"/>
+                <w:sz w:val="12"/>
+                <w:szCs w:val="12"/>
+              </w:rPr>
+            </w:pPr>
+            <w:r>
+              <w:rPr>
+                <w:b/>
+                <w:bCs/>
+                <w:color w:val="000000"/>
+                <w:sz w:val="12"/>
+                <w:szCs w:val="12"/>
               </w:rPr>
               <w:t>Tahsil edilen toplam tutar</w:t>
             </w:r>
@@ -2430,15 +2506,15 @@
             <w:pPr>
               <w:jc w:val="right"/>
               <w:rPr>
-                <w:sz w:val="14"/>
-                <w:szCs w:val="14"/>
-              </w:rPr>
-            </w:pPr>
-            <w:r>
-              <w:rPr>
-                <w:color w:val="000000"/>
-                <w:sz w:val="14"/>
-                <w:szCs w:val="14"/>
+                <w:sz w:val="12"/>
+                <w:szCs w:val="12"/>
+              </w:rPr>
+            </w:pPr>
+            <w:r>
+              <w:rPr>
+                <w:color w:val="000000"/>
+                <w:sz w:val="12"/>
+                <w:szCs w:val="12"/>
               </w:rPr>
               <w:t>123.505,20</w:t>
             </w:r>
@@ -2464,8 +2540,8 @@
           <w:p>
             <w:pPr>
               <w:rPr>
-                <w:sz w:val="14"/>
-                <w:szCs w:val="14"/>
+                <w:sz w:val="12"/>
+                <w:szCs w:val="12"/>
               </w:rPr>
             </w:pPr>
           </w:p>
@@ -2497,17 +2573,17 @@
           <w:p>
             <w:pPr>
               <w:rPr>
-                <w:sz w:val="14"/>
-                <w:szCs w:val="14"/>
-              </w:rPr>
-            </w:pPr>
-            <w:r>
-              <w:rPr>
-                <w:b/>
-                <w:bCs/>
-                <w:color w:val="000000"/>
-                <w:sz w:val="14"/>
-                <w:szCs w:val="14"/>
+                <w:sz w:val="12"/>
+                <w:szCs w:val="12"/>
+              </w:rPr>
+            </w:pPr>
+            <w:r>
+              <w:rPr>
+                <w:b/>
+                <w:bCs/>
+                <w:color w:val="000000"/>
+                <w:sz w:val="12"/>
+                <w:szCs w:val="12"/>
               </w:rPr>
               <w:t>İhtar masrafı (KDV Dahil)</w:t>
             </w:r>
@@ -2534,15 +2610,15 @@
             <w:pPr>
               <w:jc w:val="right"/>
               <w:rPr>
-                <w:sz w:val="14"/>
-                <w:szCs w:val="14"/>
-              </w:rPr>
-            </w:pPr>
-            <w:r>
-              <w:rPr>
-                <w:color w:val="000000"/>
-                <w:sz w:val="14"/>
-                <w:szCs w:val="14"/>
+                <w:sz w:val="12"/>
+                <w:szCs w:val="12"/>
+              </w:rPr>
+            </w:pPr>
+            <w:r>
+              <w:rPr>
+                <w:color w:val="000000"/>
+                <w:sz w:val="12"/>
+                <w:szCs w:val="12"/>
               </w:rPr>
               <w:t>1.000,00</w:t>
             </w:r>
@@ -2568,8 +2644,8 @@
           <w:p>
             <w:pPr>
               <w:rPr>
-                <w:sz w:val="14"/>
-                <w:szCs w:val="14"/>
+                <w:sz w:val="12"/>
+                <w:szCs w:val="12"/>
               </w:rPr>
             </w:pPr>
           </w:p>
@@ -2601,17 +2677,17 @@
           <w:p>
             <w:pPr>
               <w:rPr>
-                <w:sz w:val="14"/>
-                <w:szCs w:val="14"/>
-              </w:rPr>
-            </w:pPr>
-            <w:r>
-              <w:rPr>
-                <w:b/>
-                <w:bCs/>
-                <w:color w:val="000000"/>
-                <w:sz w:val="14"/>
-                <w:szCs w:val="14"/>
+                <w:sz w:val="12"/>
+                <w:szCs w:val="12"/>
+              </w:rPr>
+            </w:pPr>
+            <w:r>
+              <w:rPr>
+                <w:b/>
+                <w:bCs/>
+                <w:color w:val="000000"/>
+                <w:sz w:val="12"/>
+                <w:szCs w:val="12"/>
               </w:rPr>
               <w:t>Takip Tahsil Masrafı (KDV Dahil)</w:t>
             </w:r>
@@ -2638,15 +2714,15 @@
             <w:pPr>
               <w:jc w:val="right"/>
               <w:rPr>
-                <w:sz w:val="14"/>
-                <w:szCs w:val="14"/>
-              </w:rPr>
-            </w:pPr>
-            <w:r>
-              <w:rPr>
-                <w:color w:val="000000"/>
-                <w:sz w:val="14"/>
-                <w:szCs w:val="14"/>
+                <w:sz w:val="12"/>
+                <w:szCs w:val="12"/>
+              </w:rPr>
+            </w:pPr>
+            <w:r>
+              <w:rPr>
+                <w:color w:val="000000"/>
+                <w:sz w:val="12"/>
+                <w:szCs w:val="12"/>
               </w:rPr>
               <w:t>4.940,21</w:t>
             </w:r>
@@ -2672,8 +2748,8 @@
           <w:p>
             <w:pPr>
               <w:rPr>
-                <w:sz w:val="14"/>
-                <w:szCs w:val="14"/>
+                <w:sz w:val="12"/>
+                <w:szCs w:val="12"/>
               </w:rPr>
             </w:pPr>
           </w:p>
@@ -2705,17 +2781,17 @@
           <w:p>
             <w:pPr>
               <w:rPr>
-                <w:sz w:val="14"/>
-                <w:szCs w:val="14"/>
-              </w:rPr>
-            </w:pPr>
-            <w:r>
-              <w:rPr>
-                <w:b/>
-                <w:bCs/>
-                <w:color w:val="000000"/>
-                <w:sz w:val="14"/>
-                <w:szCs w:val="14"/>
+                <w:sz w:val="12"/>
+                <w:szCs w:val="12"/>
+              </w:rPr>
+            </w:pPr>
+            <w:r>
+              <w:rPr>
+                <w:b/>
+                <w:bCs/>
+                <w:color w:val="000000"/>
+                <w:sz w:val="12"/>
+                <w:szCs w:val="12"/>
               </w:rPr>
               <w:t>Vazgeçme Akçesi</w:t>
             </w:r>
@@ -2742,15 +2818,15 @@
             <w:pPr>
               <w:jc w:val="right"/>
               <w:rPr>
-                <w:sz w:val="14"/>
-                <w:szCs w:val="14"/>
-              </w:rPr>
-            </w:pPr>
-            <w:r>
-              <w:rPr>
-                <w:color w:val="000000"/>
-                <w:sz w:val="14"/>
-                <w:szCs w:val="14"/>
+                <w:sz w:val="12"/>
+                <w:szCs w:val="12"/>
+              </w:rPr>
+            </w:pPr>
+            <w:r>
+              <w:rPr>
+                <w:color w:val="000000"/>
+                <w:sz w:val="12"/>
+                <w:szCs w:val="12"/>
               </w:rPr>
               <w:t>61.752,60</w:t>
             </w:r>
@@ -2776,8 +2852,8 @@
           <w:p>
             <w:pPr>
               <w:rPr>
-                <w:sz w:val="14"/>
-                <w:szCs w:val="14"/>
+                <w:sz w:val="12"/>
+                <w:szCs w:val="12"/>
               </w:rPr>
             </w:pPr>
           </w:p>
@@ -2809,8 +2885,8 @@
           <w:p>
             <w:pPr>
               <w:rPr>
-                <w:sz w:val="14"/>
-                <w:szCs w:val="14"/>
+                <w:sz w:val="12"/>
+                <w:szCs w:val="12"/>
               </w:rPr>
             </w:pPr>
             <w:r>
@@ -2818,8 +2894,8 @@
                 <w:b/>
                 <w:bCs/>
                 <w:color w:val="FF0000"/>
-                <w:sz w:val="14"/>
-                <w:szCs w:val="14"/>
+                <w:sz w:val="12"/>
+                <w:szCs w:val="12"/>
               </w:rPr>
               <w:t>Kalan Tutar</w:t>
             </w:r>
@@ -2846,8 +2922,8 @@
             <w:pPr>
               <w:jc w:val="right"/>
               <w:rPr>
-                <w:sz w:val="14"/>
-                <w:szCs w:val="14"/>
+                <w:sz w:val="12"/>
+                <w:szCs w:val="12"/>
               </w:rPr>
             </w:pPr>
             <w:r>
@@ -2855,8 +2931,8 @@
                 <w:b/>
                 <w:bCs/>
                 <w:color w:val="FF0000"/>
-                <w:sz w:val="14"/>
-                <w:szCs w:val="14"/>
+                <w:sz w:val="12"/>
+                <w:szCs w:val="12"/>
               </w:rPr>
               <w:t>55.812,39</w:t>
             </w:r>
@@ -2882,8 +2958,8 @@
           <w:p>
             <w:pPr>
               <w:rPr>
-                <w:sz w:val="14"/>
-                <w:szCs w:val="14"/>
+                <w:sz w:val="12"/>
+                <w:szCs w:val="12"/>
               </w:rPr>
             </w:pPr>
           </w:p>
@@ -2893,8 +2969,119 @@
     <w:p>
       <w:pPr>
         <w:rPr>
-          <w:sz w:val="14"/>
-          <w:szCs w:val="14"/>
+          <w:sz w:val="12"/>
+          <w:szCs w:val="12"/>
+        </w:rPr>
+      </w:pPr>
+    </w:p>
+    <w:tbl>
+      <w:tblPr>
+        <w:tblW w:w="9360" w:type="dxa"/>
+        <w:tblBorders>
+          <w:top w:val="single" w:sz="4" w:space="0" w:color="auto"/>
+          <w:left w:val="single" w:sz="4" w:space="0" w:color="auto"/>
+          <w:bottom w:val="single" w:sz="4" w:space="0" w:color="auto"/>
+          <w:right w:val="single" w:sz="4" w:space="0" w:color="auto"/>
+          <w:insideH w:val="single" w:sz="4" w:space="0" w:color="auto"/>
+          <w:insideV w:val="single" w:sz="4" w:space="0" w:color="auto"/>
+        </w:tblBorders>
+        <w:tblCellMar>
+          <w:left w:w="10" w:type="dxa"/>
+          <w:right w:w="10" w:type="dxa"/>
+        </w:tblCellMar>
+        <w:tblLook w:val="0000" w:firstRow="0" w:lastRow="0" w:firstColumn="0" w:lastColumn="0" w:noHBand="0" w:noVBand="0"/>
+      </w:tblPr>
+      <w:tblGrid>
+        <w:gridCol w:w="9360"/>
+      </w:tblGrid>
+      <w:tr>
+        <w:tc>
+          <w:tcPr>
+            <w:tcW w:w="9360" w:type="dxa"/>
+            <w:tcBorders>
+              <w:top w:val="none" w:sz="0" w:space="0" w:color="FFFFFF"/>
+              <w:left w:val="none" w:sz="0" w:space="0" w:color="FFFFFF"/>
+              <w:bottom w:val="none" w:sz="0" w:space="0" w:color="FFFFFF"/>
+              <w:right w:val="none" w:sz="0" w:space="0" w:color="FFFFFF"/>
+            </w:tcBorders>
+            <w:tcMar>
+              <w:top w:w="80" w:type="dxa"/>
+              <w:left w:w="120" w:type="dxa"/>
+              <w:bottom w:w="80" w:type="dxa"/>
+              <w:right w:w="120" w:type="dxa"/>
+            </w:tcMar>
+            <w:vAlign w:val="center"/>
+          </w:tcPr>
+          <w:p>
+            <w:pPr>
+              <w:rPr>
+                <w:sz w:val="16"/>
+                <w:szCs w:val="16"/>
+              </w:rPr>
+            </w:pPr>
+            <w:r>
+              <w:rPr>
+                <w:b/>
+                <w:bCs/>
+                <w:color w:val="FF0000"/>
+                <w:sz w:val="16"/>
+                <w:szCs w:val="16"/>
+              </w:rPr>
+              <w:t>İHTAR</w:t>
+            </w:r>
+          </w:p>
+        </w:tc>
+      </w:tr>
+    </w:tbl>
+    <w:p>
+      <w:pPr>
+        <w:rPr>
+          <w:sz w:val="16"/>
+          <w:szCs w:val="16"/>
+        </w:rPr>
+      </w:pPr>
+      <w:r>
+        <w:rPr>
+          <w:sz w:val="16"/>
+          <w:szCs w:val="16"/>
+        </w:rPr>
+        <w:t xml:space="preserve">Gecikme </w:t>
+      </w:r>
+      <w:r>
+        <w:rPr>
+          <w:sz w:val="16"/>
+          <w:szCs w:val="16"/>
+        </w:rPr>
+        <w:t xml:space="preserve">{{ihtar_kelimesi}} </w:t>
+      </w:r>
+      <w:r>
+        <w:rPr>
+          <w:sz w:val="16"/>
+          <w:szCs w:val="16"/>
+        </w:rPr>
+        <w:t>{{teblig}} ile tebliğ olmuştur.</w:t>
+      </w:r>
+    </w:p>
+    <w:p>
+      <w:pPr>
+        <w:rPr>
+          <w:sz w:val="16"/>
+          <w:szCs w:val="16"/>
+        </w:rPr>
+      </w:pPr>
+      <w:r>
+        <w:rPr>
+          <w:sz w:val="16"/>
+          <w:szCs w:val="16"/>
+        </w:rPr>
+        <w:t>&lt;&lt;teblig_tarihi_list&gt;&gt;</w:t>
+      </w:r>
+    </w:p>
+    <w:p>
+      <w:pPr>
+        <w:rPr>
+          <w:sz w:val="12"/>
+          <w:szCs w:val="12"/>
         </w:rPr>
       </w:pPr>
     </w:p>
@@ -2992,7 +3179,35 @@
           <w:sz w:val="16"/>
           <w:szCs w:val="16"/>
         </w:rPr>
-        <w:t>Müşteriye 55.812,39 TL iade edilecek tutar bulunmamaktadır.</w:t>
+        <w:t xml:space="preserve">Müşteriye </w:t>
+      </w:r>
+      <w:r>
+        <w:rPr>
+          <w:sz w:val="16"/>
+          <w:szCs w:val="16"/>
+        </w:rPr>
+        <w:t>{{kalan}}</w:t>
+      </w:r>
+      <w:r>
+        <w:rPr>
+          <w:sz w:val="16"/>
+          <w:szCs w:val="16"/>
+        </w:rPr>
+        <w:t xml:space="preserve"> </w:t>
+      </w:r>
+      <w:r>
+        <w:rPr>
+          <w:sz w:val="16"/>
+          <w:szCs w:val="16"/>
+        </w:rPr>
+        <w:t>{{pb}}</w:t>
+      </w:r>
+      <w:r>
+        <w:rPr>
+          <w:sz w:val="16"/>
+          <w:szCs w:val="16"/>
+        </w:rPr>
+        <w:t xml:space="preserve"> iade edilecek tutar bulunmaktadır.</w:t>
       </w:r>
     </w:p>
     <w:p/>
@@ -3093,6 +3308,9 @@
         </w:tc>
       </w:tr>
       <w:tr>
+        <w:trPr>
+          <w:trHeight w:val="17"/>
+        </w:trPr>
         <w:tc>
           <w:tcPr>
             <w:tcW w:w="4680" w:type="dxa"/>
@@ -3165,13 +3383,51 @@
     </w:tbl>
     <w:p/>
     <w:sectPr>
-      <w:pgSz w:w="16838" w:h="11906" w:orient="landscape"/>
-      <w:pgMar w:top="720" w:right="1000" w:bottom="720" w:left="1000" w:header="708" w:footer="708" w:gutter="0"/>
+      <w:pgSz w:w="11906" w:h="16838"/>
+      <w:pgMar w:top="1000" w:right="720" w:bottom="1000" w:left="720" w:header="708" w:footer="708" w:gutter="0"/>
       <w:cols w:space="708"/>
       <w:docGrid w:linePitch="360"/>
     </w:sectPr>
   </w:body>
 </w:document>
+</file>
+
+<file path=word/endnotes.xml><?xml version="1.0" encoding="utf-8"?>
+<w:endnotes xmlns:wpc="http://schemas.microsoft.com/office/word/2010/wordprocessingCanvas" xmlns:cx="http://schemas.microsoft.com/office/drawing/2014/chartex" xmlns:cx1="http://schemas.microsoft.com/office/drawing/2015/9/8/chartex" xmlns:cx2="http://schemas.microsoft.com/office/drawing/2015/10/21/chartex" xmlns:cx3="http://schemas.microsoft.com/office/drawing/2016/5/9/chartex" xmlns:cx4="http://schemas.microsoft.com/office/drawing/2016/5/10/chartex" xmlns:cx5="http://schemas.microsoft.com/office/drawing/2016/5/11/chartex" xmlns:cx6="http://schemas.microsoft.com/office/drawing/2016/5/12/chartex" xmlns:cx7="http://schemas.microsoft.com/office/drawing/2016/5/13/chartex" xmlns:cx8="http://schemas.microsoft.com/office/drawing/2016/5/14/chartex" xmlns:mc="http://schemas.openxmlformats.org/markup-compatibility/2006" xmlns:aink="http://schemas.microsoft.com/office/drawing/2016/ink" xmlns:am3d="http://schemas.microsoft.com/office/drawing/2017/model3d" xmlns:o="urn:schemas-microsoft-com:office:office" xmlns:oel="http://schemas.microsoft.com/office/2019/extlst" xmlns:r="http://schemas.openxmlformats.org/officeDocument/2006/relationships" xmlns:m="http://schemas.openxmlformats.org/officeDocument/2006/math" xmlns:v="urn:schemas-microsoft-com:vml" xmlns:wp14="http://schemas.microsoft.com/office/word/2010/wordprocessingDrawing" xmlns:wp="http://schemas.openxmlformats.org/drawingml/2006/wordprocessingDrawing" xmlns:w10="urn:schemas-microsoft-com:office:word" xmlns:w="http://schemas.openxmlformats.org/wordprocessingml/2006/main" xmlns:w14="http://schemas.microsoft.com/office/word/2010/wordml" xmlns:w15="http://schemas.microsoft.com/office/word/2012/wordml" xmlns:w16cex="http://schemas.microsoft.com/office/word/2018/wordml/cex" xmlns:w16cid="http://schemas.microsoft.com/office/word/2016/wordml/cid" xmlns:w16="http://schemas.microsoft.com/office/word/2018/wordml" xmlns:w16du="http://schemas.microsoft.com/office/word/2023/wordml/word16du" xmlns:w16sdtdh="http://schemas.microsoft.com/office/word/2020/wordml/sdtdatahash" xmlns:w16sdtfl="http://schemas.microsoft.com/office/word/2024/wordml/sdtformatlock" xmlns:w16se="http://schemas.microsoft.com/office/word/2015/wordml/symex" xmlns:wpg="http://schemas.microsoft.com/office/word/2010/wordprocessingGroup" xmlns:wpi="http://schemas.microsoft.com/office/word/2010/wordprocessingInk" xmlns:wne="http://schemas.microsoft.com/office/word/2006/wordml" xmlns:wps="http://schemas.microsoft.com/office/word/2010/wordprocessingShape" mc:Ignorable="w14 w15 w16se w16cid w16 w16cex w16sdtdh w16sdtfl w16du wp14">
+  <w:endnote w:type="separator" w:id="-1">
+    <w:p>
+      <w:r>
+        <w:separator/>
+      </w:r>
+    </w:p>
+  </w:endnote>
+  <w:endnote w:type="continuationSeparator" w:id="0">
+    <w:p>
+      <w:r>
+        <w:continuationSeparator/>
+      </w:r>
+    </w:p>
+  </w:endnote>
+</w:endnotes>
+</file>
+
+<file path=word/footnotes.xml><?xml version="1.0" encoding="utf-8"?>
+<w:footnotes xmlns:wpc="http://schemas.microsoft.com/office/word/2010/wordprocessingCanvas" xmlns:cx="http://schemas.microsoft.com/office/drawing/2014/chartex" xmlns:cx1="http://schemas.microsoft.com/office/drawing/2015/9/8/chartex" xmlns:cx2="http://schemas.microsoft.com/office/drawing/2015/10/21/chartex" xmlns:cx3="http://schemas.microsoft.com/office/drawing/2016/5/9/chartex" xmlns:cx4="http://schemas.microsoft.com/office/drawing/2016/5/10/chartex" xmlns:cx5="http://schemas.microsoft.com/office/drawing/2016/5/11/chartex" xmlns:cx6="http://schemas.microsoft.com/office/drawing/2016/5/12/chartex" xmlns:cx7="http://schemas.microsoft.com/office/drawing/2016/5/13/chartex" xmlns:cx8="http://schemas.microsoft.com/office/drawing/2016/5/14/chartex" xmlns:mc="http://schemas.openxmlformats.org/markup-compatibility/2006" xmlns:aink="http://schemas.microsoft.com/office/drawing/2016/ink" xmlns:am3d="http://schemas.microsoft.com/office/drawing/2017/model3d" xmlns:o="urn:schemas-microsoft-com:office:office" xmlns:oel="http://schemas.microsoft.com/office/2019/extlst" xmlns:r="http://schemas.openxmlformats.org/officeDocument/2006/relationships" xmlns:m="http://schemas.openxmlformats.org/officeDocument/2006/math" xmlns:v="urn:schemas-microsoft-com:vml" xmlns:wp14="http://schemas.microsoft.com/office/word/2010/wordprocessingDrawing" xmlns:wp="http://schemas.openxmlformats.org/drawingml/2006/wordprocessingDrawing" xmlns:w10="urn:schemas-microsoft-com:office:word" xmlns:w="http://schemas.openxmlformats.org/wordprocessingml/2006/main" xmlns:w14="http://schemas.microsoft.com/office/word/2010/wordml" xmlns:w15="http://schemas.microsoft.com/office/word/2012/wordml" xmlns:w16cex="http://schemas.microsoft.com/office/word/2018/wordml/cex" xmlns:w16cid="http://schemas.microsoft.com/office/word/2016/wordml/cid" xmlns:w16="http://schemas.microsoft.com/office/word/2018/wordml" xmlns:w16du="http://schemas.microsoft.com/office/word/2023/wordml/word16du" xmlns:w16sdtdh="http://schemas.microsoft.com/office/word/2020/wordml/sdtdatahash" xmlns:w16sdtfl="http://schemas.microsoft.com/office/word/2024/wordml/sdtformatlock" xmlns:w16se="http://schemas.microsoft.com/office/word/2015/wordml/symex" xmlns:wpg="http://schemas.microsoft.com/office/word/2010/wordprocessingGroup" xmlns:wpi="http://schemas.microsoft.com/office/word/2010/wordprocessingInk" xmlns:wne="http://schemas.microsoft.com/office/word/2006/wordml" xmlns:wps="http://schemas.microsoft.com/office/word/2010/wordprocessingShape" mc:Ignorable="w14 w15 w16se w16cid w16 w16cex w16sdtdh w16sdtfl w16du wp14">
+  <w:footnote w:type="separator" w:id="-1">
+    <w:p>
+      <w:r>
+        <w:separator/>
+      </w:r>
+    </w:p>
+  </w:footnote>
+  <w:footnote w:type="continuationSeparator" w:id="0">
+    <w:p>
+      <w:r>
+        <w:continuationSeparator/>
+      </w:r>
+    </w:p>
+  </w:footnote>
+</w:footnotes>
 </file>
 
 <file path=word/numbering.xml><?xml version="1.0" encoding="utf-8"?>
@@ -3859,6 +4115,71 @@
       <w:szCs w:val="20"/>
     </w:rPr>
   </w:style>
+  <w:style w:type="paragraph" w:styleId="stBilgi">
+    <w:name w:val="header"/>
+    <w:basedOn w:val="Normal"/>
+    <w:link w:val="stBilgiChar"/>
+    <w:uiPriority w:val="99"/>
+    <w:unhideWhenUsed/>
+    <w:rsid w:val="00EB48CB"/>
+    <w:pPr>
+      <w:tabs>
+        <w:tab w:val="center" w:pos="4536"/>
+        <w:tab w:val="right" w:pos="9072"/>
+      </w:tabs>
+    </w:pPr>
+  </w:style>
+  <w:style w:type="character" w:customStyle="1" w:styleId="stBilgiChar">
+    <w:name w:val="Üst Bilgi Char"/>
+    <w:basedOn w:val="VarsaylanParagrafYazTipi"/>
+    <w:link w:val="stBilgi"/>
+    <w:uiPriority w:val="99"/>
+    <w:rsid w:val="00EB48CB"/>
+  </w:style>
+  <w:style w:type="paragraph" w:styleId="AltBilgi">
+    <w:name w:val="footer"/>
+    <w:basedOn w:val="Normal"/>
+    <w:link w:val="AltBilgiChar"/>
+    <w:uiPriority w:val="99"/>
+    <w:unhideWhenUsed/>
+    <w:rsid w:val="00EB48CB"/>
+    <w:pPr>
+      <w:tabs>
+        <w:tab w:val="center" w:pos="4536"/>
+        <w:tab w:val="right" w:pos="9072"/>
+      </w:tabs>
+    </w:pPr>
+  </w:style>
+  <w:style w:type="character" w:customStyle="1" w:styleId="AltBilgiChar">
+    <w:name w:val="Alt Bilgi Char"/>
+    <w:basedOn w:val="VarsaylanParagrafYazTipi"/>
+    <w:link w:val="AltBilgi"/>
+    <w:uiPriority w:val="99"/>
+    <w:rsid w:val="00EB48CB"/>
+  </w:style>
+  <w:style w:type="paragraph" w:styleId="HTMLncedenBiimlendirilmi">
+    <w:name w:val="HTML Preformatted"/>
+    <w:basedOn w:val="Normal"/>
+    <w:link w:val="HTMLncedenBiimlendirilmiChar"/>
+    <w:uiPriority w:val="99"/>
+    <w:semiHidden/>
+    <w:unhideWhenUsed/>
+    <w:rsid w:val="005F7C1B"/>
+    <w:rPr>
+      <w:rFonts w:ascii="Consolas" w:hAnsi="Consolas"/>
+    </w:rPr>
+  </w:style>
+  <w:style w:type="character" w:customStyle="1" w:styleId="HTMLncedenBiimlendirilmiChar">
+    <w:name w:val="HTML Önceden Biçimlendirilmiş Char"/>
+    <w:basedOn w:val="VarsaylanParagrafYazTipi"/>
+    <w:link w:val="HTMLncedenBiimlendirilmi"/>
+    <w:uiPriority w:val="99"/>
+    <w:semiHidden/>
+    <w:rsid w:val="005F7C1B"/>
+    <w:rPr>
+      <w:rFonts w:ascii="Consolas" w:hAnsi="Consolas"/>
+    </w:rPr>
+  </w:style>
 </w:styles>
 </file>
 
@@ -4175,4 +4496,16 @@
     </a:ext>
   </a:extLst>
 </a:theme>
+</file>
+
+<file path=customXml/item1.xml><?xml version="1.0" encoding="utf-8"?>
+<b:Sources xmlns:b="http://schemas.openxmlformats.org/officeDocument/2006/bibliography" xmlns="http://schemas.openxmlformats.org/officeDocument/2006/bibliography" SelectedStyle="\APASixthEditionOfficeOnline.xsl" StyleName="APA" Version="6"/>
+</file>
+
+<file path=customXml/itemProps1.xml><?xml version="1.0" encoding="utf-8"?>
+<ds:datastoreItem xmlns:ds="http://schemas.openxmlformats.org/officeDocument/2006/customXml" ds:itemID="{4A8BF5D0-813B-4C44-AF16-0C2C6DE4B815}">
+  <ds:schemaRefs>
+    <ds:schemaRef ds:uri="http://schemas.openxmlformats.org/officeDocument/2006/bibliography"/>
+  </ds:schemaRefs>
+</ds:datastoreItem>
 </file>
</xml_diff>